<commit_message>
docs: organize software practice submission
</commit_message>
<xml_diff>
--- a/软件实践安排(202509).docx
+++ b/软件实践安排(202509).docx
@@ -5936,7 +5936,7 @@
             <v:path o:extrusionok="f" gradientshapeok="t" o:connecttype="rect"/>
             <o:lock v:ext="edit" aspectratio="t"/>
           </v:shapetype>
-          <v:shape id="_x0000_i1030" type="#_x0000_t75" style="width:387.15pt;height:224.85pt">
+          <v:shape id="_x0000_i1030" type="#_x0000_t75" style="width:385.7pt;height:226.3pt">
             <v:imagedata r:id="rId10" o:title=""/>
           </v:shape>
         </w:pict>
@@ -15742,6 +15742,13 @@
                 <w:lang w:eastAsia="zh-CN"/>
               </w:rPr>
             </w:pPr>
+            <w:r>
+              <w:rPr>
+                <w:rFonts w:ascii="Segoe UI Emoji" w:eastAsia="宋体" w:hAnsi="Segoe UI Emoji" w:cs="Segoe UI Emoji" w:hint="eastAsia"/>
+                <w:lang w:eastAsia="zh-CN"/>
+              </w:rPr>
+              <w:t>✔</w:t>
+            </w:r>
           </w:p>
         </w:tc>
         <w:tc>
@@ -15882,6 +15889,13 @@
                 <w:lang w:eastAsia="zh-CN"/>
               </w:rPr>
             </w:pPr>
+            <w:r>
+              <w:rPr>
+                <w:rFonts w:ascii="Segoe UI Emoji" w:eastAsia="宋体" w:hAnsi="Segoe UI Emoji" w:cs="Segoe UI Emoji" w:hint="eastAsia"/>
+                <w:lang w:eastAsia="zh-CN"/>
+              </w:rPr>
+              <w:t>✔</w:t>
+            </w:r>
           </w:p>
         </w:tc>
         <w:tc>
@@ -16210,6 +16224,13 @@
                 <w:lang w:eastAsia="zh-CN"/>
               </w:rPr>
             </w:pPr>
+            <w:r>
+              <w:rPr>
+                <w:rFonts w:ascii="Segoe UI Emoji" w:eastAsia="宋体" w:hAnsi="Segoe UI Emoji" w:cs="Segoe UI Emoji" w:hint="eastAsia"/>
+                <w:lang w:eastAsia="zh-CN"/>
+              </w:rPr>
+              <w:t>✔</w:t>
+            </w:r>
           </w:p>
         </w:tc>
         <w:tc>
@@ -16379,6 +16400,13 @@
                 <w:lang w:eastAsia="zh-CN"/>
               </w:rPr>
             </w:pPr>
+            <w:r>
+              <w:rPr>
+                <w:rFonts w:ascii="Segoe UI Emoji" w:eastAsia="宋体" w:hAnsi="Segoe UI Emoji" w:cs="Segoe UI Emoji" w:hint="eastAsia"/>
+                <w:lang w:eastAsia="zh-CN"/>
+              </w:rPr>
+              <w:t>✔</w:t>
+            </w:r>
           </w:p>
         </w:tc>
         <w:tc>
@@ -16665,6 +16693,13 @@
                 <w:lang w:eastAsia="zh-CN"/>
               </w:rPr>
             </w:pPr>
+            <w:r>
+              <w:rPr>
+                <w:rFonts w:ascii="Segoe UI Emoji" w:eastAsia="宋体" w:hAnsi="Segoe UI Emoji" w:cs="Segoe UI Emoji" w:hint="eastAsia"/>
+                <w:lang w:eastAsia="zh-CN"/>
+              </w:rPr>
+              <w:t>✔</w:t>
+            </w:r>
           </w:p>
         </w:tc>
         <w:tc>
@@ -19371,7 +19406,7 @@
     <w:lsdException w:name="HTML Sample" w:semiHidden="1" w:unhideWhenUsed="1"/>
     <w:lsdException w:name="HTML Typewriter" w:semiHidden="1" w:unhideWhenUsed="1"/>
     <w:lsdException w:name="HTML Variable" w:semiHidden="1" w:unhideWhenUsed="1"/>
-    <w:lsdException w:name="Normal Table" w:uiPriority="99" w:qFormat="1"/>
+    <w:lsdException w:name="Normal Table" w:semiHidden="1" w:uiPriority="99" w:unhideWhenUsed="1" w:qFormat="1"/>
     <w:lsdException w:name="annotation subject" w:semiHidden="1" w:unhideWhenUsed="1"/>
     <w:lsdException w:name="No List" w:semiHidden="1" w:uiPriority="99" w:unhideWhenUsed="1"/>
     <w:lsdException w:name="Outline List 1" w:semiHidden="1" w:uiPriority="99" w:unhideWhenUsed="1"/>
@@ -19418,8 +19453,10 @@
     <w:lsdException w:name="Table Subtle 2" w:semiHidden="1" w:unhideWhenUsed="1"/>
     <w:lsdException w:name="Table Web 1" w:semiHidden="1" w:unhideWhenUsed="1"/>
     <w:lsdException w:name="Table Web 2" w:semiHidden="1" w:unhideWhenUsed="1"/>
+    <w:lsdException w:name="Table Web 3" w:semiHidden="1" w:unhideWhenUsed="1"/>
     <w:lsdException w:name="Balloon Text" w:semiHidden="1" w:uiPriority="99" w:unhideWhenUsed="1" w:qFormat="1"/>
     <w:lsdException w:name="Table Grid" w:uiPriority="59" w:qFormat="1"/>
+    <w:lsdException w:name="Table Theme" w:semiHidden="1" w:unhideWhenUsed="1"/>
     <w:lsdException w:name="Placeholder Text" w:semiHidden="1" w:uiPriority="99"/>
     <w:lsdException w:name="No Spacing" w:uiPriority="99"/>
     <w:lsdException w:name="Light Shading" w:uiPriority="60"/>

</xml_diff>

<commit_message>
feat: add user operation and course acceptance manual for vCampus system
</commit_message>
<xml_diff>
--- a/软件实践安排(202509).docx
+++ b/软件实践安排(202509).docx
@@ -1068,7 +1068,6 @@
                               <w:szCs w:val="36"/>
                             </w:rPr>
                           </w:pPr>
-                          <w:proofErr w:type="gramStart"/>
                           <w:r>
                             <w:rPr>
                               <w:color w:val="9BBB59"/>
@@ -1086,7 +1085,6 @@
                             </w:rPr>
                             <w:t xml:space="preserve">  </w:t>
                           </w:r>
-                          <w:proofErr w:type="spellStart"/>
                           <w:r>
                             <w:rPr>
                               <w:rFonts w:ascii="宋体" w:eastAsia="宋体"/>
@@ -1096,8 +1094,6 @@
                             </w:rPr>
                             <w:t>课程说明</w:t>
                           </w:r>
-                          <w:proofErr w:type="spellEnd"/>
-                          <w:proofErr w:type="gramEnd"/>
                         </w:p>
                       </w:txbxContent>
                     </v:textbox>
@@ -1215,39 +1211,7 @@
                 <w:rFonts w:ascii="宋体" w:eastAsia="宋体" w:hAnsi="宋体" w:hint="eastAsia"/>
                 <w:lang w:eastAsia="zh-CN"/>
               </w:rPr>
-              <w:t>虚拟校园【分层设计；功能模块】；开发环境【Eclipse/</w:t>
-            </w:r>
-            <w:proofErr w:type="spellStart"/>
-            <w:r>
-              <w:rPr>
-                <w:rFonts w:ascii="宋体" w:eastAsia="宋体" w:hAnsi="宋体" w:hint="eastAsia"/>
-                <w:lang w:eastAsia="zh-CN"/>
-              </w:rPr>
-              <w:t>Netbeans</w:t>
-            </w:r>
-            <w:proofErr w:type="spellEnd"/>
-            <w:r>
-              <w:rPr>
-                <w:rFonts w:ascii="宋体" w:eastAsia="宋体" w:hAnsi="宋体" w:hint="eastAsia"/>
-                <w:lang w:eastAsia="zh-CN"/>
-              </w:rPr>
-              <w:t xml:space="preserve">/VS Code/IJ，ACCESS, </w:t>
-            </w:r>
-            <w:proofErr w:type="spellStart"/>
-            <w:r>
-              <w:rPr>
-                <w:rFonts w:ascii="宋体" w:eastAsia="宋体" w:hAnsi="宋体" w:hint="eastAsia"/>
-                <w:lang w:eastAsia="zh-CN"/>
-              </w:rPr>
-              <w:t>Sqlite</w:t>
-            </w:r>
-            <w:proofErr w:type="spellEnd"/>
-            <w:r>
-              <w:rPr>
-                <w:rFonts w:ascii="宋体" w:eastAsia="宋体" w:hAnsi="宋体" w:hint="eastAsia"/>
-                <w:lang w:eastAsia="zh-CN"/>
-              </w:rPr>
-              <w:t>】</w:t>
+              <w:t>虚拟校园【分层设计；功能模块】；开发环境【Eclipse/Netbeans/VS Code/IJ，ACCESS, Sqlite】</w:t>
             </w:r>
           </w:p>
           <w:p>
@@ -1380,23 +1344,7 @@
                 <w:rFonts w:ascii="宋体" w:eastAsia="宋体" w:hAnsi="宋体" w:hint="eastAsia"/>
                 <w:lang w:eastAsia="zh-CN"/>
               </w:rPr>
-              <w:t xml:space="preserve">S架构，即包含客户端与服务器端两个部分。编程开发语言采用Java，客户端界面设计可使用Swing库。推荐开发环境使用Eclipse 或 </w:t>
-            </w:r>
-            <w:proofErr w:type="spellStart"/>
-            <w:r>
-              <w:rPr>
-                <w:rFonts w:ascii="宋体" w:eastAsia="宋体" w:hAnsi="宋体" w:hint="eastAsia"/>
-                <w:lang w:eastAsia="zh-CN"/>
-              </w:rPr>
-              <w:t>Netbeans</w:t>
-            </w:r>
-            <w:proofErr w:type="spellEnd"/>
-            <w:r>
-              <w:rPr>
-                <w:rFonts w:ascii="宋体" w:eastAsia="宋体" w:hAnsi="宋体" w:hint="eastAsia"/>
-                <w:lang w:eastAsia="zh-CN"/>
-              </w:rPr>
-              <w:t>，数据库使用Access。</w:t>
+              <w:t>S架构，即包含客户端与服务器端两个部分。编程开发语言采用Java，客户端界面设计可使用Swing库。推荐开发环境使用Eclipse 或 Netbeans，数据库使用Access。</w:t>
             </w:r>
           </w:p>
           <w:p>
@@ -1430,23 +1378,7 @@
                 <w:rFonts w:ascii="宋体" w:eastAsia="宋体" w:hAnsi="宋体" w:hint="eastAsia"/>
                 <w:lang w:eastAsia="zh-CN"/>
               </w:rPr>
-              <w:t>可选技术</w:t>
-            </w:r>
-            <w:proofErr w:type="gramStart"/>
-            <w:r>
-              <w:rPr>
-                <w:rFonts w:ascii="宋体" w:eastAsia="宋体" w:hAnsi="宋体" w:hint="eastAsia"/>
-                <w:lang w:eastAsia="zh-CN"/>
-              </w:rPr>
-              <w:t>栈</w:t>
-            </w:r>
-            <w:proofErr w:type="gramEnd"/>
-            <w:r>
-              <w:rPr>
-                <w:rFonts w:ascii="宋体" w:eastAsia="宋体" w:hAnsi="宋体" w:hint="eastAsia"/>
-                <w:lang w:eastAsia="zh-CN"/>
-              </w:rPr>
-              <w:t>：</w:t>
+              <w:t>可选技术栈：</w:t>
             </w:r>
           </w:p>
           <w:p>
@@ -1511,39 +1443,7 @@
                 <w:rFonts w:ascii="宋体" w:eastAsia="宋体" w:hAnsi="宋体" w:hint="eastAsia"/>
                 <w:lang w:eastAsia="zh-CN"/>
               </w:rPr>
-              <w:t>- 团队协作与代码管理推荐</w:t>
-            </w:r>
-            <w:proofErr w:type="spellStart"/>
-            <w:r>
-              <w:rPr>
-                <w:rFonts w:ascii="宋体" w:eastAsia="宋体" w:hAnsi="宋体" w:hint="eastAsia"/>
-                <w:lang w:eastAsia="zh-CN"/>
-              </w:rPr>
-              <w:t>Gitee</w:t>
-            </w:r>
-            <w:proofErr w:type="spellEnd"/>
-            <w:r>
-              <w:rPr>
-                <w:rFonts w:ascii="宋体" w:eastAsia="宋体" w:hAnsi="宋体" w:hint="eastAsia"/>
-                <w:lang w:eastAsia="zh-CN"/>
-              </w:rPr>
-              <w:t xml:space="preserve"> (</w:t>
-            </w:r>
-            <w:proofErr w:type="gramStart"/>
-            <w:r>
-              <w:rPr>
-                <w:rFonts w:ascii="宋体" w:eastAsia="宋体" w:hAnsi="宋体" w:hint="eastAsia"/>
-                <w:lang w:eastAsia="zh-CN"/>
-              </w:rPr>
-              <w:t>需学习</w:t>
-            </w:r>
-            <w:proofErr w:type="gramEnd"/>
-            <w:r>
-              <w:rPr>
-                <w:rFonts w:ascii="宋体" w:eastAsia="宋体" w:hAnsi="宋体" w:hint="eastAsia"/>
-                <w:lang w:eastAsia="zh-CN"/>
-              </w:rPr>
-              <w:t>掌握Git)</w:t>
+              <w:t>- 团队协作与代码管理推荐Gitee (需学习掌握Git)</w:t>
             </w:r>
           </w:p>
           <w:p>
@@ -1560,23 +1460,7 @@
                 <w:rFonts w:ascii="宋体" w:eastAsia="宋体" w:hAnsi="宋体" w:hint="eastAsia"/>
                 <w:lang w:eastAsia="zh-CN"/>
               </w:rPr>
-              <w:t>- 项目管理推荐使用Maven或Gradle (</w:t>
-            </w:r>
-            <w:proofErr w:type="gramStart"/>
-            <w:r>
-              <w:rPr>
-                <w:rFonts w:ascii="宋体" w:eastAsia="宋体" w:hAnsi="宋体" w:hint="eastAsia"/>
-                <w:lang w:eastAsia="zh-CN"/>
-              </w:rPr>
-              <w:t>需学习</w:t>
-            </w:r>
-            <w:proofErr w:type="gramEnd"/>
-            <w:r>
-              <w:rPr>
-                <w:rFonts w:ascii="宋体" w:eastAsia="宋体" w:hAnsi="宋体" w:hint="eastAsia"/>
-                <w:lang w:eastAsia="zh-CN"/>
-              </w:rPr>
-              <w:t>Maven或Gradle内容)</w:t>
+              <w:t>- 项目管理推荐使用Maven或Gradle (需学习Maven或Gradle内容)</w:t>
             </w:r>
           </w:p>
           <w:p>
@@ -1593,23 +1477,7 @@
                 <w:rFonts w:ascii="宋体" w:eastAsia="宋体" w:hAnsi="宋体" w:hint="eastAsia"/>
                 <w:lang w:eastAsia="zh-CN"/>
               </w:rPr>
-              <w:t>- 数据库可选支持文件式类型的DB系统，如H2，</w:t>
-            </w:r>
-            <w:proofErr w:type="spellStart"/>
-            <w:r>
-              <w:rPr>
-                <w:rFonts w:ascii="宋体" w:eastAsia="宋体" w:hAnsi="宋体" w:hint="eastAsia"/>
-                <w:lang w:eastAsia="zh-CN"/>
-              </w:rPr>
-              <w:t>Sqlite</w:t>
-            </w:r>
-            <w:proofErr w:type="spellEnd"/>
-            <w:r>
-              <w:rPr>
-                <w:rFonts w:ascii="宋体" w:eastAsia="宋体" w:hAnsi="宋体" w:hint="eastAsia"/>
-                <w:lang w:eastAsia="zh-CN"/>
-              </w:rPr>
-              <w:t>等 (需熟悉对应数据库使用方法)</w:t>
+              <w:t>- 数据库可选支持文件式类型的DB系统，如H2，Sqlite等 (需熟悉对应数据库使用方法)</w:t>
             </w:r>
           </w:p>
           <w:p>
@@ -1966,32 +1834,14 @@
                 <w:color w:val="FF0000"/>
                 <w:lang w:eastAsia="zh-CN"/>
               </w:rPr>
-              <w:t>第三节</w:t>
-            </w:r>
-            <w:proofErr w:type="gramStart"/>
+              <w:t>第三节课</w:t>
+            </w:r>
             <w:r>
               <w:rPr>
                 <w:rFonts w:ascii="宋体" w:eastAsia="宋体" w:hAnsi="宋体" w:hint="eastAsia"/>
-                <w:b/>
-                <w:color w:val="FF0000"/>
-                <w:lang w:eastAsia="zh-CN"/>
-              </w:rPr>
-              <w:t>课</w:t>
-            </w:r>
-            <w:r>
-              <w:rPr>
-                <w:rFonts w:ascii="宋体" w:eastAsia="宋体" w:hAnsi="宋体" w:hint="eastAsia"/>
-                <w:lang w:eastAsia="zh-CN"/>
-              </w:rPr>
-              <w:t>必须</w:t>
-            </w:r>
-            <w:proofErr w:type="gramEnd"/>
-            <w:r>
-              <w:rPr>
-                <w:rFonts w:ascii="宋体" w:eastAsia="宋体" w:hAnsi="宋体" w:hint="eastAsia"/>
-                <w:lang w:eastAsia="zh-CN"/>
-              </w:rPr>
-              <w:t>提交小组名单；小组建立后各个组长集中统一开会。</w:t>
+                <w:lang w:eastAsia="zh-CN"/>
+              </w:rPr>
+              <w:t>必须提交小组名单；小组建立后各个组长集中统一开会。</w:t>
             </w:r>
           </w:p>
           <w:p>
@@ -2144,34 +1994,16 @@
               </w:rPr>
               <w:t>见</w:t>
             </w:r>
-            <w:r>
-              <w:fldChar w:fldCharType="begin"/>
-            </w:r>
-            <w:r>
-              <w:rPr>
-                <w:lang w:eastAsia="zh-CN"/>
-              </w:rPr>
-              <w:instrText xml:space="preserve"> HYPERLINK \l "_附件：各种文档模板" </w:instrText>
-            </w:r>
-            <w:r>
-              <w:fldChar w:fldCharType="separate"/>
-            </w:r>
-            <w:r>
-              <w:rPr>
-                <w:rStyle w:val="af"/>
-                <w:rFonts w:ascii="宋体" w:eastAsia="宋体" w:hAnsi="宋体" w:hint="eastAsia"/>
-                <w:lang w:eastAsia="zh-CN"/>
-              </w:rPr>
-              <w:t>附录</w:t>
-            </w:r>
-            <w:r>
-              <w:rPr>
-                <w:rStyle w:val="af"/>
-                <w:rFonts w:ascii="宋体" w:eastAsia="宋体" w:hAnsi="宋体"/>
-                <w:lang w:eastAsia="zh-CN"/>
-              </w:rPr>
-              <w:fldChar w:fldCharType="end"/>
-            </w:r>
+            <w:hyperlink w:anchor="_附件：各种文档模板" w:history="1">
+              <w:r>
+                <w:rPr>
+                  <w:rStyle w:val="af"/>
+                  <w:rFonts w:ascii="宋体" w:eastAsia="宋体" w:hAnsi="宋体" w:hint="eastAsia"/>
+                  <w:lang w:eastAsia="zh-CN"/>
+                </w:rPr>
+                <w:t>附录</w:t>
+              </w:r>
+            </w:hyperlink>
             <w:r>
               <w:rPr>
                 <w:rStyle w:val="af"/>
@@ -2221,34 +2053,16 @@
               </w:rPr>
               <w:t>清单见</w:t>
             </w:r>
-            <w:r>
-              <w:fldChar w:fldCharType="begin"/>
-            </w:r>
-            <w:r>
-              <w:rPr>
-                <w:lang w:eastAsia="zh-CN"/>
-              </w:rPr>
-              <w:instrText xml:space="preserve"> HYPERLINK \l "_项目资料提交清单【需要教师现场验收或邮件回复认可后方能给成绩】" </w:instrText>
-            </w:r>
-            <w:r>
-              <w:fldChar w:fldCharType="separate"/>
-            </w:r>
-            <w:r>
-              <w:rPr>
-                <w:rStyle w:val="ae"/>
-                <w:rFonts w:ascii="宋体" w:eastAsia="宋体" w:hAnsi="宋体" w:hint="eastAsia"/>
-                <w:lang w:eastAsia="zh-CN"/>
-              </w:rPr>
-              <w:t>附录：项目提交资料清单</w:t>
-            </w:r>
-            <w:r>
-              <w:rPr>
-                <w:rStyle w:val="ae"/>
-                <w:rFonts w:ascii="宋体" w:eastAsia="宋体" w:hAnsi="宋体"/>
-                <w:lang w:eastAsia="zh-CN"/>
-              </w:rPr>
-              <w:fldChar w:fldCharType="end"/>
-            </w:r>
+            <w:hyperlink w:anchor="_项目资料提交清单【需要教师现场验收或邮件回复认可后方能给成绩】" w:history="1">
+              <w:r>
+                <w:rPr>
+                  <w:rStyle w:val="ae"/>
+                  <w:rFonts w:ascii="宋体" w:eastAsia="宋体" w:hAnsi="宋体" w:hint="eastAsia"/>
+                  <w:lang w:eastAsia="zh-CN"/>
+                </w:rPr>
+                <w:t>附录：项目提交资料清单</w:t>
+              </w:r>
+            </w:hyperlink>
             <w:r>
               <w:rPr>
                 <w:rFonts w:ascii="宋体" w:eastAsia="宋体" w:hAnsi="宋体" w:hint="eastAsia"/>
@@ -2334,7 +2148,6 @@
                             </w:rPr>
                             <w:t xml:space="preserve">2 </w:t>
                           </w:r>
-                          <w:proofErr w:type="spellStart"/>
                           <w:r>
                             <w:rPr>
                               <w:rFonts w:ascii="宋体" w:eastAsia="宋体"/>
@@ -2345,7 +2158,6 @@
                             </w:rPr>
                             <w:t>开题讲评</w:t>
                           </w:r>
-                          <w:proofErr w:type="spellEnd"/>
                         </w:p>
                       </w:txbxContent>
                     </v:textbox>
@@ -2506,23 +2318,7 @@
                 <w:rFonts w:ascii="宋体" w:eastAsia="宋体" w:hAnsi="宋体" w:hint="eastAsia"/>
                 <w:lang w:eastAsia="zh-CN"/>
               </w:rPr>
-              <w:t>指定每</w:t>
-            </w:r>
-            <w:proofErr w:type="gramStart"/>
-            <w:r>
-              <w:rPr>
-                <w:rFonts w:ascii="宋体" w:eastAsia="宋体" w:hAnsi="宋体" w:hint="eastAsia"/>
-                <w:lang w:eastAsia="zh-CN"/>
-              </w:rPr>
-              <w:t>周小组</w:t>
-            </w:r>
-            <w:proofErr w:type="gramEnd"/>
-            <w:r>
-              <w:rPr>
-                <w:rFonts w:ascii="宋体" w:eastAsia="宋体" w:hAnsi="宋体" w:hint="eastAsia"/>
-                <w:lang w:eastAsia="zh-CN"/>
-              </w:rPr>
-              <w:t>进度计划并按时提交</w:t>
+              <w:t>指定每周小组进度计划并按时提交</w:t>
             </w:r>
           </w:p>
           <w:p>
@@ -2578,7 +2374,6 @@
               </w:rPr>
               <w:t>系统设计</w:t>
             </w:r>
-            <w:proofErr w:type="gramStart"/>
             <w:r>
               <w:rPr>
                 <w:rFonts w:ascii="宋体" w:eastAsia="宋体" w:hAnsi="宋体"/>
@@ -2591,15 +2386,7 @@
                 <w:rFonts w:ascii="宋体" w:eastAsia="宋体" w:hAnsi="宋体" w:hint="eastAsia"/>
                 <w:lang w:eastAsia="zh-CN"/>
               </w:rPr>
-              <w:t>计划</w:t>
-            </w:r>
-            <w:proofErr w:type="gramEnd"/>
-            <w:r>
-              <w:rPr>
-                <w:rFonts w:ascii="宋体" w:eastAsia="宋体" w:hAnsi="宋体" w:hint="eastAsia"/>
-                <w:lang w:eastAsia="zh-CN"/>
-              </w:rPr>
-              <w:t>制定</w:t>
+              <w:t>计划制定</w:t>
             </w:r>
             <w:r>
               <w:rPr>
@@ -2828,34 +2615,16 @@
               </w:rPr>
               <w:t>分析得出</w:t>
             </w:r>
-            <w:r>
-              <w:fldChar w:fldCharType="begin"/>
-            </w:r>
-            <w:r>
-              <w:rPr>
-                <w:lang w:eastAsia="zh-CN"/>
-              </w:rPr>
-              <w:instrText xml:space="preserve"> HYPERLINK \l "_E-R图" </w:instrText>
-            </w:r>
-            <w:r>
-              <w:fldChar w:fldCharType="separate"/>
-            </w:r>
-            <w:r>
-              <w:rPr>
-                <w:rStyle w:val="af"/>
-                <w:rFonts w:ascii="宋体" w:eastAsia="宋体" w:hAnsi="宋体" w:hint="eastAsia"/>
-                <w:lang w:eastAsia="zh-CN"/>
-              </w:rPr>
-              <w:t>E-R图</w:t>
-            </w:r>
-            <w:r>
-              <w:rPr>
-                <w:rStyle w:val="af"/>
-                <w:rFonts w:ascii="宋体" w:eastAsia="宋体" w:hAnsi="宋体"/>
-                <w:lang w:eastAsia="zh-CN"/>
-              </w:rPr>
-              <w:fldChar w:fldCharType="end"/>
-            </w:r>
+            <w:hyperlink w:anchor="_E-R图" w:history="1">
+              <w:r>
+                <w:rPr>
+                  <w:rStyle w:val="af"/>
+                  <w:rFonts w:ascii="宋体" w:eastAsia="宋体" w:hAnsi="宋体" w:hint="eastAsia"/>
+                  <w:lang w:eastAsia="zh-CN"/>
+                </w:rPr>
+                <w:t>E-R图</w:t>
+              </w:r>
+            </w:hyperlink>
             <w:r>
               <w:rPr>
                 <w:rFonts w:ascii="宋体" w:eastAsia="宋体" w:hAnsi="宋体" w:hint="eastAsia"/>
@@ -2932,23 +2701,7 @@
                 <w:rFonts w:ascii="宋体" w:eastAsia="宋体" w:hAnsi="宋体" w:hint="eastAsia"/>
                 <w:lang w:eastAsia="zh-CN"/>
               </w:rPr>
-              <w:t>分析确定数据库中的字段类型、命名规范(如表名</w:t>
-            </w:r>
-            <w:proofErr w:type="spellStart"/>
-            <w:r>
-              <w:rPr>
-                <w:rFonts w:ascii="宋体" w:eastAsia="宋体" w:hAnsi="宋体" w:hint="eastAsia"/>
-                <w:lang w:eastAsia="zh-CN"/>
-              </w:rPr>
-              <w:t>tblUser</w:t>
-            </w:r>
-            <w:proofErr w:type="spellEnd"/>
-            <w:r>
-              <w:rPr>
-                <w:rFonts w:ascii="宋体" w:eastAsia="宋体" w:hAnsi="宋体" w:hint="eastAsia"/>
-                <w:lang w:eastAsia="zh-CN"/>
-              </w:rPr>
-              <w:t>)等</w:t>
+              <w:t>分析确定数据库中的字段类型、命名规范(如表名tblUser)等</w:t>
             </w:r>
           </w:p>
           <w:p>
@@ -3060,7 +2813,6 @@
                               <w:szCs w:val="36"/>
                             </w:rPr>
                           </w:pPr>
-                          <w:proofErr w:type="gramStart"/>
                           <w:r>
                             <w:rPr>
                               <w:color w:val="9BBB59"/>
@@ -3078,7 +2830,6 @@
                             </w:rPr>
                             <w:t xml:space="preserve">  </w:t>
                           </w:r>
-                          <w:proofErr w:type="spellStart"/>
                           <w:r>
                             <w:rPr>
                               <w:rFonts w:ascii="宋体" w:eastAsia="宋体"/>
@@ -3088,8 +2839,6 @@
                             </w:rPr>
                             <w:t>开发设计</w:t>
                           </w:r>
-                          <w:proofErr w:type="spellEnd"/>
-                          <w:proofErr w:type="gramEnd"/>
                         </w:p>
                       </w:txbxContent>
                     </v:textbox>
@@ -3268,34 +3017,16 @@
               </w:rPr>
               <w:t>遵照</w:t>
             </w:r>
-            <w:r>
-              <w:fldChar w:fldCharType="begin"/>
-            </w:r>
-            <w:r>
-              <w:rPr>
-                <w:lang w:eastAsia="zh-CN"/>
-              </w:rPr>
-              <w:instrText xml:space="preserve"> HYPERLINK "file:///F:\\2025-26-暑期学校\\计算机学院%20%20专业技能实训（企业）\\常规文档规范\\Java编码规范.doc" </w:instrText>
-            </w:r>
-            <w:r>
-              <w:fldChar w:fldCharType="separate"/>
-            </w:r>
-            <w:r>
-              <w:rPr>
-                <w:rStyle w:val="af"/>
-                <w:rFonts w:ascii="宋体" w:eastAsia="宋体" w:hAnsi="宋体" w:hint="eastAsia"/>
-                <w:lang w:eastAsia="zh-CN"/>
-              </w:rPr>
-              <w:t>JAVA编码规范</w:t>
-            </w:r>
-            <w:r>
-              <w:rPr>
-                <w:rStyle w:val="af"/>
-                <w:rFonts w:ascii="宋体" w:eastAsia="宋体" w:hAnsi="宋体"/>
-                <w:lang w:eastAsia="zh-CN"/>
-              </w:rPr>
-              <w:fldChar w:fldCharType="end"/>
-            </w:r>
+            <w:hyperlink r:id="rId10" w:history="1">
+              <w:r>
+                <w:rPr>
+                  <w:rStyle w:val="af"/>
+                  <w:rFonts w:ascii="宋体" w:eastAsia="宋体" w:hAnsi="宋体" w:hint="eastAsia"/>
+                  <w:lang w:eastAsia="zh-CN"/>
+                </w:rPr>
+                <w:t>JAVA编码规范</w:t>
+              </w:r>
+            </w:hyperlink>
             <w:r>
               <w:rPr>
                 <w:rFonts w:ascii="宋体" w:eastAsia="宋体" w:hAnsi="宋体" w:hint="eastAsia"/>
@@ -3405,19 +3136,23 @@
                 <w:color w:val="FF0000"/>
                 <w:lang w:eastAsia="zh-CN"/>
               </w:rPr>
-              <w:t>最终提交程序命名为vCampusClient.jar和vCampusServer.jar[可运行]；数据库名称为</w:t>
-            </w:r>
-            <w:proofErr w:type="spellStart"/>
+              <w:t>最终提交程序命名为vCampusClient.jar和vCampusServer.jar[可运行]；数据库名称为vCampus</w:t>
+            </w:r>
+          </w:p>
+          <w:p>
+            <w:pPr>
+              <w:rPr>
+                <w:rFonts w:ascii="宋体" w:eastAsia="宋体" w:hAnsi="宋体"/>
+                <w:lang w:eastAsia="zh-CN"/>
+              </w:rPr>
+            </w:pPr>
             <w:r>
               <w:rPr>
                 <w:rFonts w:ascii="宋体" w:eastAsia="宋体" w:hAnsi="宋体" w:hint="eastAsia"/>
-                <w:b/>
-                <w:color w:val="FF0000"/>
-                <w:lang w:eastAsia="zh-CN"/>
-              </w:rPr>
-              <w:t>vCampus</w:t>
-            </w:r>
-            <w:proofErr w:type="spellEnd"/>
+                <w:lang w:eastAsia="zh-CN"/>
+              </w:rPr>
+              <w:t>多线程：实现多客户端处理；线程的管理</w:t>
+            </w:r>
           </w:p>
           <w:p>
             <w:pPr>
@@ -3431,7 +3166,7 @@
                 <w:rFonts w:ascii="宋体" w:eastAsia="宋体" w:hAnsi="宋体" w:hint="eastAsia"/>
                 <w:lang w:eastAsia="zh-CN"/>
               </w:rPr>
-              <w:t>多线程：实现多客户端处理；线程的管理</w:t>
+              <w:t>Socket：利用对象流传输消息</w:t>
             </w:r>
           </w:p>
           <w:p>
@@ -3446,51 +3181,18 @@
                 <w:rFonts w:ascii="宋体" w:eastAsia="宋体" w:hAnsi="宋体" w:hint="eastAsia"/>
                 <w:lang w:eastAsia="zh-CN"/>
               </w:rPr>
-              <w:t>Socket：利用对象流传输消息</w:t>
-            </w:r>
-          </w:p>
-          <w:p>
-            <w:pPr>
-              <w:rPr>
-                <w:rFonts w:ascii="宋体" w:eastAsia="宋体" w:hAnsi="宋体"/>
-                <w:lang w:eastAsia="zh-CN"/>
-              </w:rPr>
-            </w:pPr>
-            <w:r>
-              <w:rPr>
-                <w:rFonts w:ascii="宋体" w:eastAsia="宋体" w:hAnsi="宋体" w:hint="eastAsia"/>
-                <w:lang w:eastAsia="zh-CN"/>
-              </w:rPr>
               <w:t>山寨QQ。</w:t>
             </w:r>
-            <w:r>
-              <w:fldChar w:fldCharType="begin"/>
-            </w:r>
-            <w:r>
-              <w:rPr>
-                <w:lang w:eastAsia="zh-CN"/>
-              </w:rPr>
-              <w:instrText xml:space="preserve"> HYPERLINK "file:///F:\\2025-26-暑期学校\\计算机学院%20%20专业技能实训（企业）\\JAVA编程常见问题集锦.docx" </w:instrText>
-            </w:r>
-            <w:r>
-              <w:fldChar w:fldCharType="separate"/>
-            </w:r>
-            <w:r>
-              <w:rPr>
-                <w:rStyle w:val="af"/>
-                <w:rFonts w:ascii="宋体" w:eastAsia="宋体" w:hAnsi="宋体" w:hint="eastAsia"/>
-                <w:lang w:eastAsia="zh-CN"/>
-              </w:rPr>
-              <w:t>JAVA编程常见问题集锦</w:t>
-            </w:r>
-            <w:r>
-              <w:rPr>
-                <w:rStyle w:val="af"/>
-                <w:rFonts w:ascii="宋体" w:eastAsia="宋体" w:hAnsi="宋体"/>
-                <w:lang w:eastAsia="zh-CN"/>
-              </w:rPr>
-              <w:fldChar w:fldCharType="end"/>
-            </w:r>
+            <w:hyperlink r:id="rId11" w:history="1">
+              <w:r>
+                <w:rPr>
+                  <w:rStyle w:val="af"/>
+                  <w:rFonts w:ascii="宋体" w:eastAsia="宋体" w:hAnsi="宋体" w:hint="eastAsia"/>
+                  <w:lang w:eastAsia="zh-CN"/>
+                </w:rPr>
+                <w:t>JAVA编程常见问题集锦</w:t>
+              </w:r>
+            </w:hyperlink>
             <w:r>
               <w:rPr>
                 <w:rFonts w:ascii="宋体" w:eastAsia="宋体" w:hAnsi="宋体" w:hint="eastAsia"/>
@@ -4127,7 +3829,6 @@
               </w:rPr>
               <w:t>部署</w:t>
             </w:r>
-            <w:proofErr w:type="gramStart"/>
             <w:r>
               <w:rPr>
                 <w:rFonts w:ascii="宋体" w:eastAsia="宋体" w:hAnsi="宋体"/>
@@ -4168,15 +3869,7 @@
                 <w:rFonts w:ascii="宋体" w:eastAsia="宋体" w:hAnsi="宋体" w:hint="eastAsia"/>
                 <w:lang w:eastAsia="zh-CN"/>
               </w:rPr>
-              <w:t>正常</w:t>
-            </w:r>
-            <w:proofErr w:type="gramEnd"/>
-            <w:r>
-              <w:rPr>
-                <w:rFonts w:ascii="宋体" w:eastAsia="宋体" w:hAnsi="宋体" w:hint="eastAsia"/>
-                <w:lang w:eastAsia="zh-CN"/>
-              </w:rPr>
-              <w:t>/容错</w:t>
+              <w:t>正常/容错</w:t>
             </w:r>
           </w:p>
           <w:p>
@@ -4310,17 +4003,8 @@
           <w:rFonts w:ascii="宋体" w:eastAsia="宋体" w:hAnsi="宋体" w:hint="eastAsia"/>
           <w:lang w:eastAsia="zh-CN"/>
         </w:rPr>
-        <w:t>分解任务并执行---</w:t>
-      </w:r>
-      <w:proofErr w:type="spellStart"/>
-      <w:r>
-        <w:rPr>
-          <w:rFonts w:ascii="宋体" w:eastAsia="宋体" w:hAnsi="宋体" w:hint="eastAsia"/>
-          <w:lang w:eastAsia="zh-CN"/>
-        </w:rPr>
-        <w:t>TestCase</w:t>
-      </w:r>
-      <w:proofErr w:type="spellEnd"/>
+        <w:t>分解任务并执行---TestCase</w:t>
+      </w:r>
     </w:p>
     <w:p>
       <w:pPr>
@@ -4658,17 +4342,8 @@
                 <w:rFonts w:ascii="宋体" w:eastAsia="宋体" w:hAnsi="宋体" w:hint="eastAsia"/>
                 <w:lang w:eastAsia="zh-CN"/>
               </w:rPr>
-              <w:t>biz/</w:t>
-            </w:r>
-            <w:proofErr w:type="spellStart"/>
-            <w:r>
-              <w:rPr>
-                <w:rFonts w:ascii="宋体" w:eastAsia="宋体" w:hAnsi="宋体" w:hint="eastAsia"/>
-                <w:lang w:eastAsia="zh-CN"/>
-              </w:rPr>
-              <w:t>srv</w:t>
-            </w:r>
-            <w:proofErr w:type="spellEnd"/>
+              <w:t>biz/srv</w:t>
+            </w:r>
           </w:p>
         </w:tc>
         <w:tc>
@@ -4729,31 +4404,13 @@
                 <w:lang w:eastAsia="zh-CN"/>
               </w:rPr>
             </w:pPr>
-            <w:proofErr w:type="spellStart"/>
             <w:r>
               <w:rPr>
                 <w:rFonts w:ascii="宋体" w:eastAsia="宋体" w:hAnsi="宋体" w:hint="eastAsia"/>
                 <w:lang w:eastAsia="zh-CN"/>
               </w:rPr>
-              <w:t>vo</w:t>
-            </w:r>
-            <w:proofErr w:type="spellEnd"/>
-            <w:r>
-              <w:rPr>
-                <w:rFonts w:ascii="宋体" w:eastAsia="宋体" w:hAnsi="宋体" w:hint="eastAsia"/>
-                <w:lang w:eastAsia="zh-CN"/>
-              </w:rPr>
-              <w:t>/domain/</w:t>
-            </w:r>
-            <w:proofErr w:type="spellStart"/>
-            <w:r>
-              <w:rPr>
-                <w:rFonts w:ascii="宋体" w:eastAsia="宋体" w:hAnsi="宋体" w:hint="eastAsia"/>
-                <w:lang w:eastAsia="zh-CN"/>
-              </w:rPr>
-              <w:t>pojo</w:t>
-            </w:r>
-            <w:proofErr w:type="spellEnd"/>
+              <w:t>vo/domain/pojo</w:t>
+            </w:r>
           </w:p>
         </w:tc>
         <w:tc>
@@ -4814,7 +4471,6 @@
                 <w:lang w:eastAsia="zh-CN"/>
               </w:rPr>
             </w:pPr>
-            <w:proofErr w:type="spellStart"/>
             <w:r>
               <w:rPr>
                 <w:rFonts w:ascii="宋体" w:eastAsia="宋体" w:hAnsi="宋体" w:hint="eastAsia"/>
@@ -4822,7 +4478,6 @@
               </w:rPr>
               <w:t>dao</w:t>
             </w:r>
-            <w:proofErr w:type="spellEnd"/>
           </w:p>
         </w:tc>
         <w:tc>
@@ -4914,48 +4569,14 @@
           <w:bCs/>
           <w:lang w:eastAsia="zh-CN"/>
         </w:rPr>
-        <w:t>线程管理</w:t>
-      </w:r>
-      <w:proofErr w:type="gramStart"/>
+        <w:t>线程管理池</w:t>
+      </w:r>
       <w:r>
         <w:rPr>
           <w:rFonts w:ascii="宋体" w:eastAsia="宋体" w:hAnsi="宋体" w:hint="eastAsia"/>
-          <w:b/>
-          <w:bCs/>
-          <w:lang w:eastAsia="zh-CN"/>
-        </w:rPr>
-        <w:t>池</w:t>
-      </w:r>
-      <w:r>
-        <w:rPr>
-          <w:rFonts w:ascii="宋体" w:eastAsia="宋体" w:hAnsi="宋体" w:hint="eastAsia"/>
-          <w:lang w:eastAsia="zh-CN"/>
-        </w:rPr>
-        <w:t>用于</w:t>
-      </w:r>
-      <w:proofErr w:type="gramEnd"/>
-      <w:r>
-        <w:rPr>
-          <w:rFonts w:ascii="宋体" w:eastAsia="宋体" w:hAnsi="宋体" w:hint="eastAsia"/>
-          <w:lang w:eastAsia="zh-CN"/>
-        </w:rPr>
-        <w:t xml:space="preserve">维护当前连接的客户端；Map&lt;String, </w:t>
-      </w:r>
-      <w:proofErr w:type="spellStart"/>
-      <w:r>
-        <w:rPr>
-          <w:rFonts w:ascii="宋体" w:eastAsia="宋体" w:hAnsi="宋体" w:hint="eastAsia"/>
-          <w:lang w:eastAsia="zh-CN"/>
-        </w:rPr>
-        <w:t>ClientThread</w:t>
-      </w:r>
-      <w:proofErr w:type="spellEnd"/>
-      <w:r>
-        <w:rPr>
-          <w:rFonts w:ascii="宋体" w:eastAsia="宋体" w:hAnsi="宋体" w:hint="eastAsia"/>
-          <w:lang w:eastAsia="zh-CN"/>
-        </w:rPr>
-        <w:t>&gt;</w:t>
+          <w:lang w:eastAsia="zh-CN"/>
+        </w:rPr>
+        <w:t>用于维护当前连接的客户端；Map&lt;String, ClientThread&gt;</w:t>
       </w:r>
     </w:p>
     <w:p>
@@ -4995,23 +4616,7 @@
           <w:rFonts w:ascii="宋体" w:eastAsia="宋体" w:hAnsi="宋体" w:hint="eastAsia"/>
           <w:lang w:eastAsia="zh-CN"/>
         </w:rPr>
-        <w:t>所有需要传输的对象必须实现可序列化接口；必须保持客户端与</w:t>
-      </w:r>
-      <w:proofErr w:type="gramStart"/>
-      <w:r>
-        <w:rPr>
-          <w:rFonts w:ascii="宋体" w:eastAsia="宋体" w:hAnsi="宋体" w:hint="eastAsia"/>
-          <w:lang w:eastAsia="zh-CN"/>
-        </w:rPr>
-        <w:t>服务器端类的</w:t>
-      </w:r>
-      <w:proofErr w:type="gramEnd"/>
-      <w:r>
-        <w:rPr>
-          <w:rFonts w:ascii="宋体" w:eastAsia="宋体" w:hAnsi="宋体" w:hint="eastAsia"/>
-          <w:lang w:eastAsia="zh-CN"/>
-        </w:rPr>
-        <w:t>一致性</w:t>
+        <w:t>所有需要传输的对象必须实现可序列化接口；必须保持客户端与服务器端类的一致性</w:t>
       </w:r>
     </w:p>
     <w:p>
@@ -5071,23 +4676,7 @@
           <w:rFonts w:ascii="宋体" w:eastAsia="宋体" w:hAnsi="宋体" w:hint="eastAsia"/>
           <w:lang w:eastAsia="zh-CN"/>
         </w:rPr>
-        <w:t xml:space="preserve">基于Git、CVS或SVN； </w:t>
-      </w:r>
-      <w:proofErr w:type="spellStart"/>
-      <w:r>
-        <w:rPr>
-          <w:rFonts w:ascii="宋体" w:eastAsia="宋体" w:hAnsi="宋体" w:hint="eastAsia"/>
-          <w:lang w:eastAsia="zh-CN"/>
-        </w:rPr>
-        <w:t>oschina</w:t>
-      </w:r>
-      <w:proofErr w:type="spellEnd"/>
-      <w:r>
-        <w:rPr>
-          <w:rFonts w:ascii="宋体" w:eastAsia="宋体" w:hAnsi="宋体" w:hint="eastAsia"/>
-          <w:lang w:eastAsia="zh-CN"/>
-        </w:rPr>
-        <w:t>, 开源中国</w:t>
+        <w:t>基于Git、CVS或SVN； oschina, 开源中国</w:t>
       </w:r>
     </w:p>
     <w:p>
@@ -5251,7 +4840,6 @@
                       <w:spacing w:before="0" w:beforeAutospacing="0" w:after="0" w:afterAutospacing="0"/>
                       <w:textAlignment w:val="baseline"/>
                     </w:pPr>
-                    <w:proofErr w:type="spellStart"/>
                     <w:r>
                       <w:rPr>
                         <w:rFonts w:ascii="Arial" w:hAnsi="Arial"/>
@@ -5260,18 +4848,7 @@
                         <w:color w:val="000000"/>
                         <w:kern w:val="24"/>
                       </w:rPr>
-                      <w:t>uid</w:t>
-                    </w:r>
-                    <w:proofErr w:type="spellEnd"/>
-                    <w:r>
-                      <w:rPr>
-                        <w:rFonts w:ascii="Arial" w:hAnsi="Arial"/>
-                        <w:b/>
-                        <w:bCs/>
-                        <w:color w:val="000000"/>
-                        <w:kern w:val="24"/>
-                      </w:rPr>
-                      <w:t xml:space="preserve"> : String // </w:t>
+                      <w:t xml:space="preserve">uid : String // </w:t>
                     </w:r>
                     <w:r>
                       <w:rPr>
@@ -5430,8 +5007,6 @@
                       <w:spacing w:before="0" w:beforeAutospacing="0" w:after="0" w:afterAutospacing="0"/>
                       <w:textAlignment w:val="baseline"/>
                     </w:pPr>
-                    <w:proofErr w:type="spellStart"/>
-                    <w:proofErr w:type="gramStart"/>
                     <w:r>
                       <w:rPr>
                         <w:rFonts w:ascii="Calibri" w:hAnsi="Calibri"/>
@@ -5442,8 +5017,6 @@
                       </w:rPr>
                       <w:t>java.io.Serializable</w:t>
                     </w:r>
-                    <w:proofErr w:type="spellEnd"/>
-                    <w:proofErr w:type="gramEnd"/>
                   </w:p>
                 </w:txbxContent>
               </v:textbox>
@@ -5546,7 +5119,6 @@
         </w:rPr>
         <w:t>需求分析与软件设计</w:t>
       </w:r>
-      <w:proofErr w:type="gramStart"/>
       <w:r>
         <w:rPr>
           <w:rFonts w:ascii="宋体" w:eastAsia="宋体" w:hAnsi="宋体"/>
@@ -5559,15 +5131,7 @@
           <w:rFonts w:ascii="宋体" w:eastAsia="宋体" w:hAnsi="宋体" w:hint="eastAsia"/>
           <w:lang w:eastAsia="zh-CN"/>
         </w:rPr>
-        <w:t>程序</w:t>
-      </w:r>
-      <w:proofErr w:type="gramEnd"/>
-      <w:r>
-        <w:rPr>
-          <w:rFonts w:ascii="宋体" w:eastAsia="宋体" w:hAnsi="宋体" w:hint="eastAsia"/>
-          <w:lang w:eastAsia="zh-CN"/>
-        </w:rPr>
-        <w:t>编制</w:t>
+        <w:t>程序编制</w:t>
       </w:r>
       <w:r>
         <w:rPr>
@@ -5735,18 +5299,8 @@
           <w:sz w:val="24"/>
           <w:lang w:eastAsia="zh-CN"/>
         </w:rPr>
-        <w:t xml:space="preserve">2. </w:t>
-      </w:r>
-      <w:proofErr w:type="spellStart"/>
-      <w:r>
-        <w:rPr>
-          <w:rFonts w:ascii="宋体" w:hAnsi="宋体" w:hint="eastAsia"/>
-          <w:sz w:val="24"/>
-          <w:lang w:eastAsia="zh-CN"/>
-        </w:rPr>
-        <w:t>系统分析</w:t>
-      </w:r>
-      <w:proofErr w:type="spellEnd"/>
+        <w:t>2. 系统分析</w:t>
+      </w:r>
     </w:p>
     <w:p>
       <w:pPr>
@@ -5766,18 +5320,8 @@
           <w:sz w:val="24"/>
           <w:lang w:eastAsia="zh-CN"/>
         </w:rPr>
-        <w:t xml:space="preserve">1) </w:t>
-      </w:r>
-      <w:proofErr w:type="spellStart"/>
-      <w:r>
-        <w:rPr>
-          <w:rFonts w:ascii="宋体" w:hAnsi="宋体" w:hint="eastAsia"/>
-          <w:sz w:val="24"/>
-          <w:lang w:eastAsia="zh-CN"/>
-        </w:rPr>
-        <w:t>可行性分析</w:t>
-      </w:r>
-      <w:proofErr w:type="spellEnd"/>
+        <w:t>1) 可行性分析</w:t>
+      </w:r>
     </w:p>
     <w:p>
       <w:pPr>
@@ -5818,18 +5362,8 @@
           <w:sz w:val="24"/>
           <w:lang w:eastAsia="zh-CN"/>
         </w:rPr>
-        <w:t xml:space="preserve">2) </w:t>
-      </w:r>
-      <w:proofErr w:type="spellStart"/>
-      <w:r>
-        <w:rPr>
-          <w:rFonts w:ascii="宋体" w:hAnsi="宋体" w:hint="eastAsia"/>
-          <w:sz w:val="24"/>
-          <w:lang w:eastAsia="zh-CN"/>
-        </w:rPr>
-        <w:t>需求分析</w:t>
-      </w:r>
-      <w:proofErr w:type="spellEnd"/>
+        <w:t>2) 需求分析</w:t>
+      </w:r>
     </w:p>
     <w:p>
       <w:pPr>
@@ -5843,34 +5377,14 @@
           <w:lang w:eastAsia="zh-CN"/>
         </w:rPr>
       </w:pPr>
-      <w:proofErr w:type="spellStart"/>
       <w:r>
         <w:rPr>
           <w:rFonts w:ascii="宋体" w:hAnsi="宋体" w:hint="eastAsia"/>
           <w:sz w:val="24"/>
           <w:lang w:eastAsia="zh-CN"/>
         </w:rPr>
-        <w:t>选课工作要完成选课输入</w:t>
-      </w:r>
-      <w:proofErr w:type="spellEnd"/>
-      <w:r>
-        <w:rPr>
-          <w:rFonts w:ascii="宋体" w:hAnsi="宋体" w:hint="eastAsia"/>
-          <w:sz w:val="24"/>
-          <w:lang w:eastAsia="zh-CN"/>
-        </w:rPr>
-        <w:t>/</w:t>
-      </w:r>
-      <w:proofErr w:type="spellStart"/>
-      <w:r>
-        <w:rPr>
-          <w:rFonts w:ascii="宋体" w:hAnsi="宋体" w:hint="eastAsia"/>
-          <w:sz w:val="24"/>
-          <w:lang w:eastAsia="zh-CN"/>
-        </w:rPr>
-        <w:t>输出、选课查询、成绩查询、改选课等功能</w:t>
-      </w:r>
-      <w:proofErr w:type="spellEnd"/>
+        <w:t>选课工作要完成选课输入/输出、选课查询、成绩查询、改选课等功能</w:t>
+      </w:r>
     </w:p>
     <w:p>
       <w:pPr>
@@ -5888,15 +5402,7 @@
           <w:rFonts w:hint="eastAsia"/>
         </w:rPr>
         <w:lastRenderedPageBreak/>
-        <w:t>E-</w:t>
-      </w:r>
-      <w:proofErr w:type="spellStart"/>
-      <w:r>
-        <w:rPr>
-          <w:rStyle w:val="ad"/>
-          <w:rFonts w:hint="eastAsia"/>
-        </w:rPr>
-        <w:t>R</w:t>
+        <w:t>E-R</w:t>
       </w:r>
       <w:r>
         <w:rPr>
@@ -5906,7 +5412,6 @@
         <w:t>图</w:t>
       </w:r>
       <w:bookmarkEnd w:id="19"/>
-      <w:proofErr w:type="spellEnd"/>
     </w:p>
     <w:p>
       <w:pPr>
@@ -5936,8 +5441,8 @@
             <v:path o:extrusionok="f" gradientshapeok="t" o:connecttype="rect"/>
             <o:lock v:ext="edit" aspectratio="t"/>
           </v:shapetype>
-          <v:shape id="_x0000_i1030" type="#_x0000_t75" style="width:385.7pt;height:226.3pt">
-            <v:imagedata r:id="rId10" o:title=""/>
+          <v:shape id="_x0000_i1030" type="#_x0000_t75" style="width:385.5pt;height:226.5pt">
+            <v:imagedata r:id="rId12" o:title=""/>
           </v:shape>
         </w:pict>
       </w:r>
@@ -5948,21 +5453,12 @@
           <w:lang w:eastAsia="zh-CN"/>
         </w:rPr>
       </w:pPr>
-      <w:proofErr w:type="spellStart"/>
       <w:r>
         <w:rPr>
           <w:rFonts w:hint="eastAsia"/>
           <w:lang w:eastAsia="zh-CN"/>
         </w:rPr>
-        <w:t>问题</w:t>
-      </w:r>
-      <w:proofErr w:type="spellEnd"/>
-      <w:r>
-        <w:rPr>
-          <w:rFonts w:hint="eastAsia"/>
-          <w:lang w:eastAsia="zh-CN"/>
-        </w:rPr>
-        <w:t>：</w:t>
+        <w:t>问题：</w:t>
       </w:r>
     </w:p>
     <w:p>
@@ -6244,14 +5740,12 @@
       </w:pPr>
     </w:p>
     <w:p>
-      <w:proofErr w:type="spellStart"/>
       <w:r>
         <w:rPr>
           <w:rFonts w:hint="eastAsia"/>
         </w:rPr>
         <w:t>数据字典</w:t>
       </w:r>
-      <w:proofErr w:type="spellEnd"/>
     </w:p>
     <w:p>
       <w:pPr>
@@ -6263,8 +5757,6 @@
         </w:rPr>
         <w:t xml:space="preserve"> </w:t>
       </w:r>
-      <w:proofErr w:type="spellStart"/>
-      <w:proofErr w:type="gramStart"/>
       <w:r>
         <w:t>D</w:t>
       </w:r>
@@ -6272,199 +5764,73 @@
         <w:rPr>
           <w:rFonts w:hint="eastAsia"/>
         </w:rPr>
-        <w:t>epartment:部门</w:t>
-      </w:r>
-      <w:proofErr w:type="gramEnd"/>
+        <w:t>epartment:部门；deptid:部门号；deptname:部门名称；</w:t>
+      </w:r>
+    </w:p>
+    <w:p>
+      <w:pPr>
+        <w:ind w:firstLineChars="150" w:firstLine="330"/>
+      </w:pPr>
       <w:r>
         <w:rPr>
           <w:rFonts w:hint="eastAsia"/>
         </w:rPr>
-        <w:t>；deptid:部门号；deptname:部门名称</w:t>
-      </w:r>
-      <w:proofErr w:type="spellEnd"/>
+        <w:t>teacher:教师tid:教师编号；sex:性别；tname:姓名；technical:职称；</w:t>
+      </w:r>
+    </w:p>
+    <w:p>
+      <w:pPr>
+        <w:ind w:firstLineChars="150" w:firstLine="330"/>
+      </w:pPr>
       <w:r>
         <w:rPr>
           <w:rFonts w:hint="eastAsia"/>
         </w:rPr>
-        <w:t>；</w:t>
+        <w:t>subject:课程；subjid:课程号；date:开课日期；subjname:课程名；num:学时数；credit:学分</w:t>
       </w:r>
     </w:p>
     <w:p>
       <w:pPr>
         <w:ind w:firstLineChars="150" w:firstLine="330"/>
       </w:pPr>
-      <w:proofErr w:type="spellStart"/>
-      <w:proofErr w:type="gramStart"/>
       <w:r>
         <w:rPr>
           <w:rFonts w:hint="eastAsia"/>
         </w:rPr>
-        <w:t>teacher:教师</w:t>
-      </w:r>
-      <w:proofErr w:type="gramEnd"/>
+        <w:t>class:班级；cid:班级代码；cname:班级名称；expername:专业名称；</w:t>
+      </w:r>
+    </w:p>
+    <w:p>
+      <w:pPr>
+        <w:ind w:firstLineChars="150" w:firstLine="330"/>
+      </w:pPr>
       <w:r>
         <w:rPr>
           <w:rFonts w:hint="eastAsia"/>
         </w:rPr>
-        <w:t>tid:教师编号；sex:性别；tname:姓名；technical:职称</w:t>
-      </w:r>
-      <w:proofErr w:type="spellEnd"/>
+        <w:t>student:学生；sid:学号，sname:姓名； sex:性别；email 邮件;idCard身份</w:t>
+      </w:r>
+    </w:p>
+    <w:p>
+      <w:pPr>
+        <w:ind w:firstLineChars="150" w:firstLine="330"/>
+      </w:pPr>
       <w:r>
         <w:rPr>
           <w:rFonts w:hint="eastAsia"/>
         </w:rPr>
-        <w:t>；</w:t>
+        <w:t>choose:选课；selectid:选课号；</w:t>
       </w:r>
     </w:p>
     <w:p>
       <w:pPr>
         <w:ind w:firstLineChars="150" w:firstLine="330"/>
       </w:pPr>
-      <w:proofErr w:type="spellStart"/>
-      <w:proofErr w:type="gramStart"/>
       <w:r>
         <w:rPr>
           <w:rFonts w:hint="eastAsia"/>
         </w:rPr>
-        <w:t>subject:课程</w:t>
-      </w:r>
-      <w:proofErr w:type="gramEnd"/>
-      <w:r>
-        <w:rPr>
-          <w:rFonts w:hint="eastAsia"/>
-        </w:rPr>
-        <w:t>；subjid:课程号；date:开课日期；subjname:课程名；num:学时数；credit:学分</w:t>
-      </w:r>
-      <w:proofErr w:type="spellEnd"/>
-    </w:p>
-    <w:p>
-      <w:pPr>
-        <w:ind w:firstLineChars="150" w:firstLine="330"/>
-      </w:pPr>
-      <w:proofErr w:type="spellStart"/>
-      <w:proofErr w:type="gramStart"/>
-      <w:r>
-        <w:rPr>
-          <w:rFonts w:hint="eastAsia"/>
-        </w:rPr>
-        <w:t>class:班级</w:t>
-      </w:r>
-      <w:proofErr w:type="gramEnd"/>
-      <w:r>
-        <w:rPr>
-          <w:rFonts w:hint="eastAsia"/>
-        </w:rPr>
-        <w:t>；cid:班级代码；cname:班级名称；expername:专业名称</w:t>
-      </w:r>
-      <w:proofErr w:type="spellEnd"/>
-      <w:r>
-        <w:rPr>
-          <w:rFonts w:hint="eastAsia"/>
-        </w:rPr>
-        <w:t>；</w:t>
-      </w:r>
-    </w:p>
-    <w:p>
-      <w:pPr>
-        <w:ind w:firstLineChars="150" w:firstLine="330"/>
-      </w:pPr>
-      <w:proofErr w:type="spellStart"/>
-      <w:proofErr w:type="gramStart"/>
-      <w:r>
-        <w:rPr>
-          <w:rFonts w:hint="eastAsia"/>
-        </w:rPr>
-        <w:t>student:学生</w:t>
-      </w:r>
-      <w:proofErr w:type="gramEnd"/>
-      <w:r>
-        <w:rPr>
-          <w:rFonts w:hint="eastAsia"/>
-        </w:rPr>
-        <w:t>；sid:学号，sname:姓名</w:t>
-      </w:r>
-      <w:proofErr w:type="spellEnd"/>
-      <w:r>
-        <w:rPr>
-          <w:rFonts w:hint="eastAsia"/>
-        </w:rPr>
-        <w:t xml:space="preserve">； </w:t>
-      </w:r>
-      <w:proofErr w:type="spellStart"/>
-      <w:r>
-        <w:rPr>
-          <w:rFonts w:hint="eastAsia"/>
-        </w:rPr>
-        <w:t>sex:性别；email</w:t>
-      </w:r>
-      <w:proofErr w:type="spellEnd"/>
-      <w:r>
-        <w:rPr>
-          <w:rFonts w:hint="eastAsia"/>
-        </w:rPr>
-        <w:t xml:space="preserve"> </w:t>
-      </w:r>
-      <w:proofErr w:type="spellStart"/>
-      <w:r>
-        <w:rPr>
-          <w:rFonts w:hint="eastAsia"/>
-        </w:rPr>
-        <w:t>邮件;idCard身份</w:t>
-      </w:r>
-      <w:proofErr w:type="spellEnd"/>
-    </w:p>
-    <w:p>
-      <w:pPr>
-        <w:ind w:firstLineChars="150" w:firstLine="330"/>
-      </w:pPr>
-      <w:proofErr w:type="spellStart"/>
-      <w:proofErr w:type="gramStart"/>
-      <w:r>
-        <w:rPr>
-          <w:rFonts w:hint="eastAsia"/>
-        </w:rPr>
-        <w:t>choose:选课</w:t>
-      </w:r>
-      <w:proofErr w:type="gramEnd"/>
-      <w:r>
-        <w:rPr>
-          <w:rFonts w:hint="eastAsia"/>
-        </w:rPr>
-        <w:t>；selectid:选课号</w:t>
-      </w:r>
-      <w:proofErr w:type="spellEnd"/>
-      <w:r>
-        <w:rPr>
-          <w:rFonts w:hint="eastAsia"/>
-        </w:rPr>
-        <w:t>；</w:t>
-      </w:r>
-    </w:p>
-    <w:p>
-      <w:pPr>
-        <w:ind w:firstLineChars="150" w:firstLine="330"/>
-      </w:pPr>
-      <w:proofErr w:type="spellStart"/>
-      <w:proofErr w:type="gramStart"/>
-      <w:r>
-        <w:rPr>
-          <w:rFonts w:hint="eastAsia"/>
-        </w:rPr>
-        <w:t>exam:考试</w:t>
-      </w:r>
-      <w:proofErr w:type="gramEnd"/>
-      <w:r>
-        <w:rPr>
-          <w:rFonts w:hint="eastAsia"/>
-        </w:rPr>
-        <w:t>；examdate:考试日期；score:成绩</w:t>
-      </w:r>
-      <w:proofErr w:type="spellEnd"/>
-      <w:r>
-        <w:rPr>
-          <w:rFonts w:hint="eastAsia"/>
-        </w:rPr>
-        <w:t>；</w:t>
+        <w:t>exam:考试；examdate:考试日期；score:成绩；</w:t>
       </w:r>
     </w:p>
     <w:p>
@@ -6676,39 +6042,21 @@
           <w:rFonts w:ascii="宋体" w:hAnsi="宋体" w:hint="eastAsia"/>
           <w:lang w:eastAsia="zh-CN"/>
         </w:rPr>
-        <w:t>（</w:t>
-      </w:r>
-      <w:proofErr w:type="spellStart"/>
+        <w:t>（第一个为组长，组长可以</w:t>
+      </w:r>
+      <w:r>
+        <w:rPr>
+          <w:rFonts w:ascii="宋体" w:eastAsia="宋体" w:hAnsi="宋体" w:hint="eastAsia"/>
+          <w:lang w:eastAsia="zh-CN"/>
+        </w:rPr>
+        <w:t>有权建议</w:t>
+      </w:r>
       <w:r>
         <w:rPr>
           <w:rFonts w:ascii="宋体" w:hAnsi="宋体" w:hint="eastAsia"/>
           <w:lang w:eastAsia="zh-CN"/>
         </w:rPr>
-        <w:t>第一个为组长，组长可以</w:t>
-      </w:r>
-      <w:proofErr w:type="spellEnd"/>
-      <w:r>
-        <w:rPr>
-          <w:rFonts w:ascii="宋体" w:eastAsia="宋体" w:hAnsi="宋体" w:hint="eastAsia"/>
-          <w:lang w:eastAsia="zh-CN"/>
-        </w:rPr>
-        <w:t>有权建议</w:t>
-      </w:r>
-      <w:proofErr w:type="spellStart"/>
-      <w:r>
-        <w:rPr>
-          <w:rFonts w:ascii="宋体" w:hAnsi="宋体" w:hint="eastAsia"/>
-          <w:lang w:eastAsia="zh-CN"/>
-        </w:rPr>
-        <w:t>组员离开他的团队</w:t>
-      </w:r>
-      <w:proofErr w:type="spellEnd"/>
-      <w:r>
-        <w:rPr>
-          <w:rFonts w:ascii="宋体" w:hAnsi="宋体" w:hint="eastAsia"/>
-          <w:lang w:eastAsia="zh-CN"/>
-        </w:rPr>
-        <w:t>）</w:t>
+        <w:t>组员离开他的团队）</w:t>
       </w:r>
       <w:r>
         <w:rPr>
@@ -6766,7 +6114,6 @@
                 <w:b/>
               </w:rPr>
             </w:pPr>
-            <w:proofErr w:type="spellStart"/>
             <w:r>
               <w:rPr>
                 <w:rFonts w:ascii="宋体" w:hAnsi="宋体" w:hint="eastAsia"/>
@@ -6774,7 +6121,6 @@
               </w:rPr>
               <w:t>组号</w:t>
             </w:r>
-            <w:proofErr w:type="spellEnd"/>
           </w:p>
         </w:tc>
         <w:tc>
@@ -6814,7 +6160,6 @@
                 <w:b/>
               </w:rPr>
             </w:pPr>
-            <w:proofErr w:type="spellStart"/>
             <w:r>
               <w:rPr>
                 <w:rFonts w:ascii="宋体" w:hAnsi="宋体" w:hint="eastAsia"/>
@@ -6822,7 +6167,6 @@
               </w:rPr>
               <w:t>姓名</w:t>
             </w:r>
-            <w:proofErr w:type="spellEnd"/>
           </w:p>
         </w:tc>
         <w:tc>
@@ -6838,7 +6182,6 @@
                 <w:b/>
               </w:rPr>
             </w:pPr>
-            <w:proofErr w:type="spellStart"/>
             <w:r>
               <w:rPr>
                 <w:rFonts w:ascii="宋体" w:hAnsi="宋体" w:hint="eastAsia"/>
@@ -6846,7 +6189,6 @@
               </w:rPr>
               <w:t>职务</w:t>
             </w:r>
-            <w:proofErr w:type="spellEnd"/>
           </w:p>
         </w:tc>
         <w:tc>
@@ -6862,7 +6204,6 @@
                 <w:b/>
               </w:rPr>
             </w:pPr>
-            <w:proofErr w:type="spellStart"/>
             <w:r>
               <w:rPr>
                 <w:rFonts w:ascii="宋体" w:hAnsi="宋体" w:hint="eastAsia"/>
@@ -6870,7 +6211,6 @@
               </w:rPr>
               <w:t>具体工作</w:t>
             </w:r>
-            <w:proofErr w:type="spellEnd"/>
           </w:p>
         </w:tc>
         <w:tc>
@@ -7833,7 +7173,6 @@
                 <w:b/>
               </w:rPr>
             </w:pPr>
-            <w:proofErr w:type="spellStart"/>
             <w:r>
               <w:rPr>
                 <w:rFonts w:ascii="宋体" w:hAnsi="宋体" w:hint="eastAsia"/>
@@ -7841,7 +7180,6 @@
               </w:rPr>
               <w:t>组号</w:t>
             </w:r>
-            <w:proofErr w:type="spellEnd"/>
           </w:p>
         </w:tc>
         <w:tc>
@@ -7881,7 +7219,6 @@
                 <w:b/>
               </w:rPr>
             </w:pPr>
-            <w:proofErr w:type="spellStart"/>
             <w:r>
               <w:rPr>
                 <w:rFonts w:ascii="宋体" w:hAnsi="宋体" w:hint="eastAsia"/>
@@ -7889,7 +7226,6 @@
               </w:rPr>
               <w:t>姓名</w:t>
             </w:r>
-            <w:proofErr w:type="spellEnd"/>
           </w:p>
         </w:tc>
         <w:tc>
@@ -7905,7 +7241,6 @@
                 <w:b/>
               </w:rPr>
             </w:pPr>
-            <w:proofErr w:type="spellStart"/>
             <w:r>
               <w:rPr>
                 <w:rFonts w:ascii="宋体" w:hAnsi="宋体" w:hint="eastAsia"/>
@@ -7913,7 +7248,6 @@
               </w:rPr>
               <w:t>职务</w:t>
             </w:r>
-            <w:proofErr w:type="spellEnd"/>
           </w:p>
         </w:tc>
         <w:tc>
@@ -7929,7 +7263,6 @@
                 <w:b/>
               </w:rPr>
             </w:pPr>
-            <w:proofErr w:type="spellStart"/>
             <w:r>
               <w:rPr>
                 <w:rFonts w:ascii="宋体" w:hAnsi="宋体" w:hint="eastAsia"/>
@@ -7937,7 +7270,6 @@
               </w:rPr>
               <w:t>具体工作</w:t>
             </w:r>
-            <w:proofErr w:type="spellEnd"/>
           </w:p>
         </w:tc>
         <w:tc>
@@ -10178,7 +9510,6 @@
                 <w:lang w:eastAsia="zh-CN"/>
               </w:rPr>
             </w:pPr>
-            <w:proofErr w:type="spellStart"/>
             <w:r>
               <w:rPr>
                 <w:rFonts w:hint="eastAsia"/>
@@ -10190,7 +9521,6 @@
               </w:rPr>
               <w:t>现场检查各组具体完成的每周阶段目标</w:t>
             </w:r>
-            <w:proofErr w:type="spellEnd"/>
           </w:p>
         </w:tc>
       </w:tr>
@@ -10889,40 +10219,19 @@
               </w:rPr>
               <w:t>各组提交</w:t>
             </w:r>
-            <w:r>
-              <w:fldChar w:fldCharType="begin"/>
-            </w:r>
-            <w:r>
-              <w:rPr>
-                <w:lang w:eastAsia="zh-CN"/>
-              </w:rPr>
-              <w:instrText xml:space="preserve"> HYPERLINK \l "_组间互评表（邮件发送至shen.list@seu.edu.cn）" </w:instrText>
-            </w:r>
-            <w:r>
-              <w:fldChar w:fldCharType="separate"/>
-            </w:r>
-            <w:r>
-              <w:rPr>
-                <w:rStyle w:val="af"/>
-                <w:rFonts w:ascii="宋体" w:eastAsia="宋体" w:hAnsi="宋体" w:cs="宋体" w:hint="eastAsia"/>
-                <w:color w:val="FF0000"/>
-                <w:sz w:val="24"/>
-                <w:highlight w:val="yellow"/>
-                <w:lang w:eastAsia="zh-CN"/>
-              </w:rPr>
-              <w:t>互评表</w:t>
-            </w:r>
-            <w:r>
-              <w:rPr>
-                <w:rStyle w:val="af"/>
-                <w:rFonts w:ascii="宋体" w:eastAsia="宋体" w:hAnsi="宋体" w:cs="宋体"/>
-                <w:color w:val="FF0000"/>
-                <w:sz w:val="24"/>
-                <w:highlight w:val="yellow"/>
-                <w:lang w:eastAsia="zh-CN"/>
-              </w:rPr>
-              <w:fldChar w:fldCharType="end"/>
-            </w:r>
+            <w:hyperlink w:anchor="_组间互评表（邮件发送至shen.list@seu.edu.cn）" w:history="1">
+              <w:r>
+                <w:rPr>
+                  <w:rStyle w:val="af"/>
+                  <w:rFonts w:ascii="宋体" w:eastAsia="宋体" w:hAnsi="宋体" w:cs="宋体" w:hint="eastAsia"/>
+                  <w:color w:val="FF0000"/>
+                  <w:sz w:val="24"/>
+                  <w:highlight w:val="yellow"/>
+                  <w:lang w:eastAsia="zh-CN"/>
+                </w:rPr>
+                <w:t>互评表</w:t>
+              </w:r>
+            </w:hyperlink>
             <w:r>
               <w:rPr>
                 <w:rFonts w:ascii="宋体" w:eastAsia="宋体" w:hAnsi="宋体" w:cs="宋体" w:hint="eastAsia"/>
@@ -11473,6 +10782,7 @@
             <w:gridSpan w:val="5"/>
           </w:tcPr>
           <w:p>
+            <w:bookmarkStart w:id="28" w:name="_Hlk240310687"/>
             <w:r>
               <w:rPr>
                 <w:rFonts w:hint="eastAsia"/>
@@ -11494,7 +10804,6 @@
                 <w:lang w:eastAsia="zh-CN"/>
               </w:rPr>
             </w:pPr>
-            <w:proofErr w:type="spellStart"/>
             <w:r>
               <w:rPr>
                 <w:rFonts w:hint="eastAsia"/>
@@ -11504,7 +10813,6 @@
               </w:rPr>
               <w:t>组评</w:t>
             </w:r>
-            <w:proofErr w:type="spellEnd"/>
             <w:r>
               <w:rPr>
                 <w:rFonts w:eastAsia="宋体" w:hint="eastAsia"/>
@@ -11576,7 +10884,6 @@
                 <w:sz w:val="24"/>
               </w:rPr>
             </w:pPr>
-            <w:proofErr w:type="spellStart"/>
             <w:r>
               <w:rPr>
                 <w:rFonts w:hint="eastAsia"/>
@@ -11584,7 +10891,6 @@
               </w:rPr>
               <w:t>项目组</w:t>
             </w:r>
-            <w:proofErr w:type="spellEnd"/>
           </w:p>
         </w:tc>
         <w:tc>
@@ -11611,7 +10917,6 @@
                 <w:sz w:val="24"/>
               </w:rPr>
             </w:pPr>
-            <w:proofErr w:type="spellStart"/>
             <w:r>
               <w:rPr>
                 <w:rFonts w:hint="eastAsia"/>
@@ -11619,7 +10924,6 @@
               </w:rPr>
               <w:t>学号</w:t>
             </w:r>
-            <w:proofErr w:type="spellEnd"/>
           </w:p>
         </w:tc>
         <w:tc>
@@ -11694,25 +10998,7 @@
                 <w:sz w:val="24"/>
                 <w:lang w:eastAsia="zh-CN"/>
               </w:rPr>
-              <w:t>组</w:t>
-            </w:r>
-            <w:proofErr w:type="gramStart"/>
-            <w:r>
-              <w:rPr>
-                <w:rFonts w:eastAsia="宋体" w:hint="eastAsia"/>
-                <w:sz w:val="24"/>
-                <w:lang w:eastAsia="zh-CN"/>
-              </w:rPr>
-              <w:t>间评价</w:t>
-            </w:r>
-            <w:proofErr w:type="gramEnd"/>
-            <w:r>
-              <w:rPr>
-                <w:rFonts w:eastAsia="宋体" w:hint="eastAsia"/>
-                <w:sz w:val="24"/>
-                <w:lang w:eastAsia="zh-CN"/>
-              </w:rPr>
-              <w:t>排序</w:t>
+              <w:t>组间评价排序</w:t>
             </w:r>
           </w:p>
           <w:p>
@@ -11764,21 +11050,12 @@
                 <w:sz w:val="24"/>
               </w:rPr>
             </w:pPr>
-            <w:proofErr w:type="spellStart"/>
             <w:r>
               <w:rPr>
                 <w:rFonts w:ascii="宋体" w:eastAsia="宋体" w:hAnsi="宋体" w:cs="宋体" w:hint="eastAsia"/>
                 <w:sz w:val="24"/>
               </w:rPr>
-              <w:t>备注</w:t>
-            </w:r>
-            <w:proofErr w:type="spellEnd"/>
-            <w:r>
-              <w:rPr>
-                <w:rFonts w:ascii="宋体" w:eastAsia="宋体" w:hAnsi="宋体" w:cs="宋体" w:hint="eastAsia"/>
-                <w:sz w:val="24"/>
-              </w:rPr>
-              <w:t>（</w:t>
+              <w:t>备注（</w:t>
             </w:r>
             <w:r>
               <w:rPr>
@@ -11815,7 +11092,6 @@
                 <w:sz w:val="30"/>
               </w:rPr>
             </w:pPr>
-            <w:proofErr w:type="spellStart"/>
             <w:r>
               <w:rPr>
                 <w:rFonts w:hint="eastAsia"/>
@@ -11823,7 +11099,6 @@
               </w:rPr>
               <w:t>组长</w:t>
             </w:r>
-            <w:proofErr w:type="spellEnd"/>
           </w:p>
         </w:tc>
         <w:tc>
@@ -12249,6 +11524,7 @@
         </w:tc>
       </w:tr>
     </w:tbl>
+    <w:bookmarkEnd w:id="28"/>
     <w:p>
       <w:pPr>
         <w:pStyle w:val="4"/>
@@ -12308,6 +11584,7 @@
             <w:gridSpan w:val="5"/>
           </w:tcPr>
           <w:p>
+            <w:bookmarkStart w:id="29" w:name="_Hlk240312066"/>
             <w:r>
               <w:rPr>
                 <w:rFonts w:hint="eastAsia"/>
@@ -12327,7 +11604,6 @@
                 <w:sz w:val="18"/>
               </w:rPr>
             </w:pPr>
-            <w:proofErr w:type="spellStart"/>
             <w:r>
               <w:rPr>
                 <w:rFonts w:hint="eastAsia"/>
@@ -12337,7 +11613,6 @@
               </w:rPr>
               <w:t>组评</w:t>
             </w:r>
-            <w:proofErr w:type="spellEnd"/>
             <w:r>
               <w:rPr>
                 <w:rFonts w:ascii="宋体" w:eastAsia="宋体" w:hAnsi="宋体" w:hint="eastAsia"/>
@@ -12379,7 +11654,6 @@
                 <w:sz w:val="24"/>
               </w:rPr>
             </w:pPr>
-            <w:proofErr w:type="spellStart"/>
             <w:r>
               <w:rPr>
                 <w:rFonts w:hint="eastAsia"/>
@@ -12387,7 +11661,6 @@
               </w:rPr>
               <w:t>项目组</w:t>
             </w:r>
-            <w:proofErr w:type="spellEnd"/>
           </w:p>
         </w:tc>
         <w:tc>
@@ -12414,7 +11687,6 @@
                 <w:sz w:val="24"/>
               </w:rPr>
             </w:pPr>
-            <w:proofErr w:type="spellStart"/>
             <w:r>
               <w:rPr>
                 <w:rFonts w:hint="eastAsia"/>
@@ -12422,7 +11694,6 @@
               </w:rPr>
               <w:t>学号</w:t>
             </w:r>
-            <w:proofErr w:type="spellEnd"/>
           </w:p>
         </w:tc>
         <w:tc>
@@ -12436,7 +11707,6 @@
                 <w:sz w:val="24"/>
               </w:rPr>
             </w:pPr>
-            <w:proofErr w:type="spellStart"/>
             <w:r>
               <w:rPr>
                 <w:rFonts w:hint="eastAsia"/>
@@ -12444,7 +11714,6 @@
               </w:rPr>
               <w:t>自我评价</w:t>
             </w:r>
-            <w:proofErr w:type="spellEnd"/>
           </w:p>
           <w:p>
             <w:pPr>
@@ -12490,7 +11759,6 @@
                 <w:lang w:eastAsia="zh-CN"/>
               </w:rPr>
             </w:pPr>
-            <w:proofErr w:type="spellStart"/>
             <w:r>
               <w:rPr>
                 <w:rFonts w:hint="eastAsia"/>
@@ -12498,7 +11766,6 @@
               </w:rPr>
               <w:t>组内评价排序</w:t>
             </w:r>
-            <w:proofErr w:type="spellEnd"/>
           </w:p>
           <w:p>
             <w:pPr>
@@ -12549,21 +11816,12 @@
                 <w:sz w:val="24"/>
               </w:rPr>
             </w:pPr>
-            <w:proofErr w:type="spellStart"/>
             <w:r>
               <w:rPr>
                 <w:rFonts w:hint="eastAsia"/>
                 <w:sz w:val="24"/>
               </w:rPr>
-              <w:t>备注（分工</w:t>
-            </w:r>
-            <w:proofErr w:type="spellEnd"/>
-            <w:r>
-              <w:rPr>
-                <w:rFonts w:hint="eastAsia"/>
-                <w:sz w:val="24"/>
-              </w:rPr>
-              <w:t>）</w:t>
+              <w:t>备注（分工）</w:t>
             </w:r>
           </w:p>
         </w:tc>
@@ -12584,7 +11842,6 @@
                 <w:sz w:val="30"/>
               </w:rPr>
             </w:pPr>
-            <w:proofErr w:type="spellStart"/>
             <w:r>
               <w:rPr>
                 <w:rFonts w:hint="eastAsia"/>
@@ -12592,7 +11849,6 @@
               </w:rPr>
               <w:t>组长</w:t>
             </w:r>
-            <w:proofErr w:type="spellEnd"/>
           </w:p>
         </w:tc>
         <w:tc>
@@ -12702,7 +11958,6 @@
                 <w:sz w:val="30"/>
               </w:rPr>
             </w:pPr>
-            <w:proofErr w:type="spellStart"/>
             <w:r>
               <w:rPr>
                 <w:rFonts w:hint="eastAsia"/>
@@ -12710,7 +11965,6 @@
               </w:rPr>
               <w:t>组员</w:t>
             </w:r>
-            <w:proofErr w:type="spellEnd"/>
           </w:p>
         </w:tc>
         <w:tc>
@@ -13113,8 +12367,9 @@
           <w:lang w:eastAsia="zh-CN"/>
         </w:rPr>
       </w:pPr>
-      <w:bookmarkStart w:id="28" w:name="_小组项目报告（A4正反面打印，所有成员签名）"/>
-      <w:bookmarkEnd w:id="28"/>
+      <w:bookmarkStart w:id="30" w:name="_小组项目报告（A4正反面打印，所有成员签名）"/>
+      <w:bookmarkEnd w:id="29"/>
+      <w:bookmarkEnd w:id="30"/>
       <w:r>
         <w:rPr>
           <w:rFonts w:ascii="宋体" w:hAnsi="宋体" w:hint="eastAsia"/>
@@ -13221,8 +12476,9 @@
           <w:lang w:eastAsia="zh-CN"/>
         </w:rPr>
       </w:pPr>
-      <w:bookmarkStart w:id="29" w:name="_Toc364588076"/>
-      <w:bookmarkStart w:id="30" w:name="_Toc32473"/>
+      <w:bookmarkStart w:id="31" w:name="_Toc364588076"/>
+      <w:bookmarkStart w:id="32" w:name="_Toc32473"/>
+      <w:bookmarkStart w:id="33" w:name="_Hlk240311288"/>
       <w:r>
         <w:rPr>
           <w:rFonts w:hint="eastAsia"/>
@@ -13239,8 +12495,8 @@
         </w:rPr>
         <w:t>项目总结</w:t>
       </w:r>
-      <w:bookmarkEnd w:id="29"/>
-      <w:bookmarkEnd w:id="30"/>
+      <w:bookmarkEnd w:id="31"/>
+      <w:bookmarkEnd w:id="32"/>
     </w:p>
     <w:p>
       <w:pPr>
@@ -13547,7 +12803,6 @@
         </w:rPr>
         <w:t>【以下为报告参考纲要；</w:t>
       </w:r>
-      <w:proofErr w:type="spellStart"/>
       <w:r>
         <w:rPr>
           <w:rFonts w:ascii="宋体" w:hAnsi="宋体" w:hint="eastAsia"/>
@@ -13556,18 +12811,7 @@
           <w:u w:val="single"/>
           <w:lang w:eastAsia="zh-CN"/>
         </w:rPr>
-        <w:t>不是系统介绍，也不是源代码说明</w:t>
-      </w:r>
-      <w:proofErr w:type="spellEnd"/>
-      <w:r>
-        <w:rPr>
-          <w:rFonts w:ascii="宋体" w:hAnsi="宋体" w:hint="eastAsia"/>
-          <w:color w:val="FF0000"/>
-          <w:sz w:val="24"/>
-          <w:u w:val="single"/>
-          <w:lang w:eastAsia="zh-CN"/>
-        </w:rPr>
-        <w:t>！</w:t>
+        <w:t>不是系统介绍，也不是源代码说明！</w:t>
       </w:r>
       <w:r>
         <w:rPr>
@@ -13810,8 +13054,9 @@
           <w:lang w:eastAsia="zh-CN"/>
         </w:rPr>
       </w:pPr>
-      <w:bookmarkStart w:id="31" w:name="_个人小结（A4打印并签名）"/>
-      <w:bookmarkEnd w:id="31"/>
+      <w:bookmarkStart w:id="34" w:name="_个人小结（A4打印并签名）"/>
+      <w:bookmarkEnd w:id="33"/>
+      <w:bookmarkEnd w:id="34"/>
       <w:r>
         <w:rPr>
           <w:rFonts w:ascii="宋体" w:hAnsi="宋体" w:hint="eastAsia"/>
@@ -13852,6 +13097,7 @@
           <w:lang w:eastAsia="zh-CN"/>
         </w:rPr>
       </w:pPr>
+      <w:bookmarkStart w:id="35" w:name="_Hlk240309984"/>
       <w:r>
         <w:pict w14:anchorId="74576BF5">
           <v:shape id="文本框 2" o:spid="_x0000_s1068" type="#_x0000_t202" style="position:absolute;margin-left:9.75pt;margin-top:12.75pt;width:694.5pt;height:510.75pt;z-index:251661312;mso-width-relative:page;mso-height-relative:page" o:preferrelative="t">
@@ -14009,7 +13255,6 @@
                       <w:lang w:eastAsia="zh-CN"/>
                     </w:rPr>
                   </w:pPr>
-                  <w:proofErr w:type="spellStart"/>
                   <w:r>
                     <w:rPr>
                       <w:rFonts w:hint="eastAsia"/>
@@ -14018,18 +13263,7 @@
                       <w:sz w:val="24"/>
                       <w:lang w:eastAsia="zh-CN"/>
                     </w:rPr>
-                    <w:t>组内工作（具体分工</w:t>
-                  </w:r>
-                  <w:proofErr w:type="spellEnd"/>
-                  <w:r>
-                    <w:rPr>
-                      <w:rFonts w:hint="eastAsia"/>
-                      <w:b/>
-                      <w:bCs/>
-                      <w:sz w:val="24"/>
-                      <w:lang w:eastAsia="zh-CN"/>
-                    </w:rPr>
-                    <w:t>）</w:t>
+                    <w:t>组内工作（具体分工）</w:t>
                   </w:r>
                 </w:p>
                 <w:p>
@@ -14080,7 +13314,6 @@
                       <w:lang w:eastAsia="zh-CN"/>
                     </w:rPr>
                   </w:pPr>
-                  <w:proofErr w:type="spellStart"/>
                   <w:r>
                     <w:rPr>
                       <w:rFonts w:hint="eastAsia"/>
@@ -14092,7 +13325,6 @@
                     </w:rPr>
                     <w:t>任务完成情况总结</w:t>
                   </w:r>
-                  <w:proofErr w:type="spellEnd"/>
                 </w:p>
                 <w:p>
                   <w:pPr>
@@ -14169,7 +13401,6 @@
                       <w:lang w:eastAsia="zh-CN"/>
                     </w:rPr>
                   </w:pPr>
-                  <w:proofErr w:type="spellStart"/>
                   <w:r>
                     <w:rPr>
                       <w:rFonts w:hint="eastAsia"/>
@@ -14181,7 +13412,6 @@
                     </w:rPr>
                     <w:t>工作小结与体会</w:t>
                   </w:r>
-                  <w:proofErr w:type="spellEnd"/>
                 </w:p>
                 <w:p>
                   <w:pPr>
@@ -14548,8 +13778,9 @@
           <w:lang w:eastAsia="zh-CN"/>
         </w:rPr>
       </w:pPr>
-      <w:bookmarkStart w:id="32" w:name="_演示答辩流程【每组不超过5分钟】"/>
-      <w:bookmarkEnd w:id="32"/>
+      <w:bookmarkStart w:id="36" w:name="_演示答辩流程【每组不超过5分钟】"/>
+      <w:bookmarkEnd w:id="35"/>
+      <w:bookmarkEnd w:id="36"/>
       <w:r>
         <w:rPr>
           <w:rFonts w:ascii="宋体" w:hAnsi="宋体" w:hint="eastAsia"/>
@@ -14578,7 +13809,6 @@
           <w:lang w:eastAsia="zh-CN"/>
         </w:rPr>
       </w:pPr>
-      <w:proofErr w:type="spellStart"/>
       <w:r>
         <w:rPr>
           <w:rFonts w:ascii="宋体" w:hAnsi="宋体" w:cs="Arial" w:hint="eastAsia"/>
@@ -14586,17 +13816,7 @@
           <w:szCs w:val="21"/>
           <w:lang w:eastAsia="zh-CN"/>
         </w:rPr>
-        <w:t>自我介绍（一句话</w:t>
-      </w:r>
-      <w:proofErr w:type="spellEnd"/>
-      <w:r>
-        <w:rPr>
-          <w:rFonts w:ascii="宋体" w:hAnsi="宋体" w:cs="Arial" w:hint="eastAsia"/>
-          <w:color w:val="000000"/>
-          <w:szCs w:val="21"/>
-          <w:lang w:eastAsia="zh-CN"/>
-        </w:rPr>
-        <w:t>）</w:t>
+        <w:t>自我介绍（一句话）</w:t>
       </w:r>
     </w:p>
     <w:p>
@@ -14616,7 +13836,6 @@
           <w:lang w:eastAsia="zh-CN"/>
         </w:rPr>
       </w:pPr>
-      <w:proofErr w:type="spellStart"/>
       <w:r>
         <w:rPr>
           <w:rFonts w:ascii="宋体" w:hAnsi="宋体" w:cs="Arial" w:hint="eastAsia"/>
@@ -14626,7 +13845,6 @@
         </w:rPr>
         <w:t>组员介绍（组员名字</w:t>
       </w:r>
-      <w:proofErr w:type="spellEnd"/>
       <w:r>
         <w:rPr>
           <w:rFonts w:ascii="宋体" w:eastAsia="宋体" w:hAnsi="宋体" w:cs="Arial" w:hint="eastAsia"/>
@@ -14699,7 +13917,6 @@
           <w:lang w:eastAsia="zh-CN"/>
         </w:rPr>
       </w:pPr>
-      <w:proofErr w:type="spellStart"/>
       <w:r>
         <w:rPr>
           <w:rFonts w:ascii="宋体" w:hAnsi="宋体" w:cs="Arial" w:hint="eastAsia"/>
@@ -14707,17 +13924,7 @@
           <w:szCs w:val="21"/>
           <w:lang w:eastAsia="zh-CN"/>
         </w:rPr>
-        <w:t>产品介绍（产品特点、如何表现设计需求等等</w:t>
-      </w:r>
-      <w:proofErr w:type="spellEnd"/>
-      <w:r>
-        <w:rPr>
-          <w:rFonts w:ascii="宋体" w:hAnsi="宋体" w:cs="Arial" w:hint="eastAsia"/>
-          <w:color w:val="000000"/>
-          <w:szCs w:val="21"/>
-          <w:lang w:eastAsia="zh-CN"/>
-        </w:rPr>
-        <w:t>）</w:t>
+        <w:t>产品介绍（产品特点、如何表现设计需求等等）</w:t>
       </w:r>
       <w:r>
         <w:rPr>
@@ -14746,7 +13953,6 @@
           <w:lang w:eastAsia="zh-CN"/>
         </w:rPr>
       </w:pPr>
-      <w:proofErr w:type="spellStart"/>
       <w:r>
         <w:rPr>
           <w:rFonts w:ascii="宋体" w:hAnsi="宋体" w:cs="Arial" w:hint="eastAsia"/>
@@ -14756,7 +13962,6 @@
         </w:rPr>
         <w:t>提问</w:t>
       </w:r>
-      <w:proofErr w:type="spellEnd"/>
     </w:p>
     <w:p>
       <w:pPr>
@@ -14909,36 +14114,17 @@
         </w:rPr>
         <w:t>答辩整个过程结束后，各组提交</w:t>
       </w:r>
-      <w:r>
-        <w:fldChar w:fldCharType="begin"/>
-      </w:r>
-      <w:r>
-        <w:rPr>
-          <w:lang w:eastAsia="zh-CN"/>
-        </w:rPr>
-        <w:instrText xml:space="preserve"> HYPERLINK \l "_项目资料提交清单【需要教师现场验收或邮件shen.list@seu.e" </w:instrText>
-      </w:r>
-      <w:r>
-        <w:fldChar w:fldCharType="separate"/>
-      </w:r>
-      <w:r>
-        <w:rPr>
-          <w:rStyle w:val="af"/>
-          <w:rFonts w:ascii="宋体" w:eastAsia="宋体" w:hAnsi="宋体" w:cs="Arial" w:hint="eastAsia"/>
-          <w:szCs w:val="21"/>
-          <w:lang w:eastAsia="zh-CN"/>
-        </w:rPr>
-        <w:t>文档资料</w:t>
-      </w:r>
-      <w:r>
-        <w:rPr>
-          <w:rStyle w:val="af"/>
-          <w:rFonts w:ascii="宋体" w:eastAsia="宋体" w:hAnsi="宋体" w:cs="Arial"/>
-          <w:szCs w:val="21"/>
-          <w:lang w:eastAsia="zh-CN"/>
-        </w:rPr>
-        <w:fldChar w:fldCharType="end"/>
-      </w:r>
+      <w:hyperlink w:anchor="_项目资料提交清单【需要教师现场验收或邮件shen.list@seu.e" w:history="1">
+        <w:r>
+          <w:rPr>
+            <w:rStyle w:val="af"/>
+            <w:rFonts w:ascii="宋体" w:eastAsia="宋体" w:hAnsi="宋体" w:cs="Arial" w:hint="eastAsia"/>
+            <w:szCs w:val="21"/>
+            <w:lang w:eastAsia="zh-CN"/>
+          </w:rPr>
+          <w:t>文档资料</w:t>
+        </w:r>
+      </w:hyperlink>
       <w:r>
         <w:rPr>
           <w:rFonts w:ascii="宋体" w:eastAsia="宋体" w:hAnsi="宋体" w:cs="Arial" w:hint="eastAsia"/>
@@ -15063,10 +14249,10 @@
           <w:lang w:eastAsia="zh-CN"/>
         </w:rPr>
       </w:pPr>
-      <w:bookmarkStart w:id="33" w:name="_项目资料提交清单【需要教师现场验收或邮件shen.list@seu.e"/>
-      <w:bookmarkStart w:id="34" w:name="_项目资料提交清单【需要教师现场验收或邮件回复认可后方能给成绩】"/>
-      <w:bookmarkEnd w:id="33"/>
-      <w:bookmarkEnd w:id="34"/>
+      <w:bookmarkStart w:id="37" w:name="_项目资料提交清单【需要教师现场验收或邮件shen.list@seu.e"/>
+      <w:bookmarkStart w:id="38" w:name="_项目资料提交清单【需要教师现场验收或邮件回复认可后方能给成绩】"/>
+      <w:bookmarkEnd w:id="37"/>
+      <w:bookmarkEnd w:id="38"/>
       <w:r>
         <w:rPr>
           <w:rFonts w:hint="eastAsia"/>
@@ -15566,6 +14752,13 @@
                 <w:lang w:eastAsia="zh-CN"/>
               </w:rPr>
             </w:pPr>
+            <w:r>
+              <w:rPr>
+                <w:rFonts w:ascii="Segoe UI Emoji" w:eastAsia="宋体" w:hAnsi="Segoe UI Emoji" w:cs="Segoe UI Emoji" w:hint="eastAsia"/>
+                <w:lang w:eastAsia="zh-CN"/>
+              </w:rPr>
+              <w:t>✔</w:t>
+            </w:r>
           </w:p>
         </w:tc>
         <w:tc>
@@ -16547,6 +15740,13 @@
                 <w:lang w:eastAsia="zh-CN"/>
               </w:rPr>
             </w:pPr>
+            <w:r>
+              <w:rPr>
+                <w:rFonts w:ascii="Segoe UI Emoji" w:eastAsia="宋体" w:hAnsi="Segoe UI Emoji" w:cs="Segoe UI Emoji" w:hint="eastAsia"/>
+                <w:lang w:eastAsia="zh-CN"/>
+              </w:rPr>
+              <w:t>✔</w:t>
+            </w:r>
           </w:p>
         </w:tc>
         <w:tc>
@@ -16877,7 +16077,6 @@
               </w:rPr>
               <w:t>使用</w:t>
             </w:r>
-            <w:proofErr w:type="spellStart"/>
             <w:r>
               <w:rPr>
                 <w:rFonts w:eastAsia="宋体" w:hint="eastAsia"/>
@@ -16885,7 +16084,6 @@
               </w:rPr>
               <w:t>JavaDoc</w:t>
             </w:r>
-            <w:proofErr w:type="spellEnd"/>
             <w:r>
               <w:rPr>
                 <w:rFonts w:eastAsia="宋体" w:hint="eastAsia"/>
@@ -17446,8 +16644,8 @@
           <w:lang w:eastAsia="zh-CN"/>
         </w:rPr>
       </w:pPr>
-      <w:bookmarkStart w:id="35" w:name="_Toc244668775"/>
-      <w:bookmarkStart w:id="36" w:name="_Toc212890274"/>
+      <w:bookmarkStart w:id="39" w:name="_Toc244668775"/>
+      <w:bookmarkStart w:id="40" w:name="_Toc212890274"/>
     </w:p>
     <w:p>
       <w:pPr>
@@ -17499,8 +16697,8 @@
         </w:rPr>
         <w:t>国家标准软件开发设计文档参考模板</w:t>
       </w:r>
-      <w:bookmarkEnd w:id="35"/>
-      <w:bookmarkEnd w:id="36"/>
+      <w:bookmarkEnd w:id="39"/>
+      <w:bookmarkEnd w:id="40"/>
     </w:p>
     <w:p>
       <w:pPr>
@@ -17512,14 +16710,12 @@
         <w:spacing w:before="0" w:after="0"/>
         <w:jc w:val="both"/>
       </w:pPr>
-      <w:proofErr w:type="spellStart"/>
       <w:r>
         <w:rPr>
           <w:rFonts w:hint="eastAsia"/>
         </w:rPr>
         <w:t>可行性研究报告</w:t>
       </w:r>
-      <w:proofErr w:type="spellEnd"/>
     </w:p>
     <w:p>
       <w:pPr>
@@ -17531,14 +16727,12 @@
         <w:spacing w:before="0" w:after="0"/>
         <w:jc w:val="both"/>
       </w:pPr>
-      <w:proofErr w:type="spellStart"/>
       <w:r>
         <w:rPr>
           <w:rFonts w:hint="eastAsia"/>
         </w:rPr>
         <w:t>项目开发计划</w:t>
       </w:r>
-      <w:proofErr w:type="spellEnd"/>
     </w:p>
     <w:p>
       <w:pPr>
@@ -17550,14 +16744,12 @@
         <w:spacing w:before="0" w:after="0"/>
         <w:jc w:val="both"/>
       </w:pPr>
-      <w:proofErr w:type="spellStart"/>
       <w:r>
         <w:rPr>
           <w:rFonts w:hint="eastAsia"/>
         </w:rPr>
         <w:t>软件需求说明书</w:t>
       </w:r>
-      <w:proofErr w:type="spellEnd"/>
     </w:p>
     <w:p>
       <w:pPr>
@@ -17569,14 +16761,12 @@
         <w:spacing w:before="0" w:after="0"/>
         <w:jc w:val="both"/>
       </w:pPr>
-      <w:proofErr w:type="spellStart"/>
       <w:r>
         <w:rPr>
           <w:rFonts w:hint="eastAsia"/>
         </w:rPr>
         <w:t>数据要求说明书</w:t>
       </w:r>
-      <w:proofErr w:type="spellEnd"/>
     </w:p>
     <w:p>
       <w:pPr>
@@ -17588,14 +16778,12 @@
         <w:spacing w:before="0" w:after="0"/>
         <w:jc w:val="both"/>
       </w:pPr>
-      <w:proofErr w:type="spellStart"/>
       <w:r>
         <w:rPr>
           <w:rFonts w:hint="eastAsia"/>
         </w:rPr>
         <w:t>概要设计说明书</w:t>
       </w:r>
-      <w:proofErr w:type="spellEnd"/>
     </w:p>
     <w:p>
       <w:pPr>
@@ -17607,14 +16795,12 @@
         <w:spacing w:before="0" w:after="0"/>
         <w:jc w:val="both"/>
       </w:pPr>
-      <w:proofErr w:type="spellStart"/>
       <w:r>
         <w:rPr>
           <w:rFonts w:hint="eastAsia"/>
         </w:rPr>
         <w:t>数据库设计说明书</w:t>
       </w:r>
-      <w:proofErr w:type="spellEnd"/>
     </w:p>
     <w:p>
       <w:pPr>
@@ -17626,14 +16812,12 @@
         <w:spacing w:before="0" w:after="0"/>
         <w:jc w:val="both"/>
       </w:pPr>
-      <w:proofErr w:type="spellStart"/>
       <w:r>
         <w:rPr>
           <w:rFonts w:hint="eastAsia"/>
         </w:rPr>
         <w:t>详细设计说明书</w:t>
       </w:r>
-      <w:proofErr w:type="spellEnd"/>
     </w:p>
     <w:p>
       <w:pPr>
@@ -17645,14 +16829,12 @@
         <w:spacing w:before="0" w:after="0"/>
         <w:jc w:val="both"/>
       </w:pPr>
-      <w:proofErr w:type="spellStart"/>
       <w:r>
         <w:rPr>
           <w:rFonts w:hint="eastAsia"/>
         </w:rPr>
         <w:t>测试计划</w:t>
       </w:r>
-      <w:proofErr w:type="spellEnd"/>
     </w:p>
     <w:p>
       <w:pPr>
@@ -17664,14 +16846,12 @@
         <w:spacing w:before="0" w:after="0"/>
         <w:jc w:val="both"/>
       </w:pPr>
-      <w:proofErr w:type="spellStart"/>
       <w:r>
         <w:rPr>
           <w:rFonts w:hint="eastAsia"/>
         </w:rPr>
         <w:t>模块开发卷宗</w:t>
       </w:r>
-      <w:proofErr w:type="spellEnd"/>
     </w:p>
     <w:p>
       <w:pPr>
@@ -17683,14 +16863,12 @@
         <w:spacing w:before="0" w:after="0"/>
         <w:jc w:val="both"/>
       </w:pPr>
-      <w:proofErr w:type="spellStart"/>
       <w:r>
         <w:rPr>
           <w:rFonts w:hint="eastAsia"/>
         </w:rPr>
         <w:t>操作手册</w:t>
       </w:r>
-      <w:proofErr w:type="spellEnd"/>
     </w:p>
     <w:p>
       <w:pPr>
@@ -17702,14 +16880,12 @@
         <w:spacing w:before="0" w:after="0"/>
         <w:jc w:val="both"/>
       </w:pPr>
-      <w:proofErr w:type="spellStart"/>
       <w:r>
         <w:rPr>
           <w:rFonts w:hint="eastAsia"/>
         </w:rPr>
         <w:t>测试分析报告</w:t>
       </w:r>
-      <w:proofErr w:type="spellEnd"/>
     </w:p>
     <w:p>
       <w:pPr>
@@ -17721,14 +16897,12 @@
         <w:spacing w:before="0" w:after="0"/>
         <w:jc w:val="both"/>
       </w:pPr>
-      <w:proofErr w:type="spellStart"/>
       <w:r>
         <w:rPr>
           <w:rFonts w:hint="eastAsia"/>
         </w:rPr>
         <w:t>用户手册</w:t>
       </w:r>
-      <w:proofErr w:type="spellEnd"/>
     </w:p>
     <w:p>
       <w:pPr>
@@ -17740,14 +16914,12 @@
         <w:spacing w:before="0" w:after="0"/>
         <w:jc w:val="both"/>
       </w:pPr>
-      <w:proofErr w:type="spellStart"/>
       <w:r>
         <w:rPr>
           <w:rFonts w:hint="eastAsia"/>
         </w:rPr>
         <w:t>项目开发总结报告</w:t>
       </w:r>
-      <w:proofErr w:type="spellEnd"/>
     </w:p>
     <w:p>
       <w:pPr>
@@ -17788,7 +16960,7 @@
           <w:lang w:eastAsia="zh-CN"/>
         </w:rPr>
       </w:pPr>
-      <w:hyperlink r:id="rId11" w:history="1">
+      <w:hyperlink r:id="rId13" w:history="1">
         <w:r>
           <w:rPr>
             <w:rStyle w:val="af"/>
@@ -17826,7 +16998,7 @@
           <w:lang w:eastAsia="zh-CN"/>
         </w:rPr>
       </w:pPr>
-      <w:hyperlink r:id="rId12" w:history="1">
+      <w:hyperlink r:id="rId14" w:history="1">
         <w:r>
           <w:rPr>
             <w:rStyle w:val="af"/>

</xml_diff>

<commit_message>
feat: add project summary and team roles documentation for vCampus
</commit_message>
<xml_diff>
--- a/软件实践安排(202509).docx
+++ b/软件实践安排(202509).docx
@@ -1068,6 +1068,7 @@
                               <w:szCs w:val="36"/>
                             </w:rPr>
                           </w:pPr>
+                          <w:proofErr w:type="gramStart"/>
                           <w:r>
                             <w:rPr>
                               <w:color w:val="9BBB59"/>
@@ -1085,6 +1086,7 @@
                             </w:rPr>
                             <w:t xml:space="preserve">  </w:t>
                           </w:r>
+                          <w:proofErr w:type="spellStart"/>
                           <w:r>
                             <w:rPr>
                               <w:rFonts w:ascii="宋体" w:eastAsia="宋体"/>
@@ -1094,6 +1096,8 @@
                             </w:rPr>
                             <w:t>课程说明</w:t>
                           </w:r>
+                          <w:proofErr w:type="spellEnd"/>
+                          <w:proofErr w:type="gramEnd"/>
                         </w:p>
                       </w:txbxContent>
                     </v:textbox>
@@ -1211,7 +1215,39 @@
                 <w:rFonts w:ascii="宋体" w:eastAsia="宋体" w:hAnsi="宋体" w:hint="eastAsia"/>
                 <w:lang w:eastAsia="zh-CN"/>
               </w:rPr>
-              <w:t>虚拟校园【分层设计；功能模块】；开发环境【Eclipse/Netbeans/VS Code/IJ，ACCESS, Sqlite】</w:t>
+              <w:t>虚拟校园【分层设计；功能模块】；开发环境【Eclipse/</w:t>
+            </w:r>
+            <w:proofErr w:type="spellStart"/>
+            <w:r>
+              <w:rPr>
+                <w:rFonts w:ascii="宋体" w:eastAsia="宋体" w:hAnsi="宋体" w:hint="eastAsia"/>
+                <w:lang w:eastAsia="zh-CN"/>
+              </w:rPr>
+              <w:t>Netbeans</w:t>
+            </w:r>
+            <w:proofErr w:type="spellEnd"/>
+            <w:r>
+              <w:rPr>
+                <w:rFonts w:ascii="宋体" w:eastAsia="宋体" w:hAnsi="宋体" w:hint="eastAsia"/>
+                <w:lang w:eastAsia="zh-CN"/>
+              </w:rPr>
+              <w:t xml:space="preserve">/VS Code/IJ，ACCESS, </w:t>
+            </w:r>
+            <w:proofErr w:type="spellStart"/>
+            <w:r>
+              <w:rPr>
+                <w:rFonts w:ascii="宋体" w:eastAsia="宋体" w:hAnsi="宋体" w:hint="eastAsia"/>
+                <w:lang w:eastAsia="zh-CN"/>
+              </w:rPr>
+              <w:t>Sqlite</w:t>
+            </w:r>
+            <w:proofErr w:type="spellEnd"/>
+            <w:r>
+              <w:rPr>
+                <w:rFonts w:ascii="宋体" w:eastAsia="宋体" w:hAnsi="宋体" w:hint="eastAsia"/>
+                <w:lang w:eastAsia="zh-CN"/>
+              </w:rPr>
+              <w:t>】</w:t>
             </w:r>
           </w:p>
           <w:p>
@@ -1344,7 +1380,23 @@
                 <w:rFonts w:ascii="宋体" w:eastAsia="宋体" w:hAnsi="宋体" w:hint="eastAsia"/>
                 <w:lang w:eastAsia="zh-CN"/>
               </w:rPr>
-              <w:t>S架构，即包含客户端与服务器端两个部分。编程开发语言采用Java，客户端界面设计可使用Swing库。推荐开发环境使用Eclipse 或 Netbeans，数据库使用Access。</w:t>
+              <w:t xml:space="preserve">S架构，即包含客户端与服务器端两个部分。编程开发语言采用Java，客户端界面设计可使用Swing库。推荐开发环境使用Eclipse 或 </w:t>
+            </w:r>
+            <w:proofErr w:type="spellStart"/>
+            <w:r>
+              <w:rPr>
+                <w:rFonts w:ascii="宋体" w:eastAsia="宋体" w:hAnsi="宋体" w:hint="eastAsia"/>
+                <w:lang w:eastAsia="zh-CN"/>
+              </w:rPr>
+              <w:t>Netbeans</w:t>
+            </w:r>
+            <w:proofErr w:type="spellEnd"/>
+            <w:r>
+              <w:rPr>
+                <w:rFonts w:ascii="宋体" w:eastAsia="宋体" w:hAnsi="宋体" w:hint="eastAsia"/>
+                <w:lang w:eastAsia="zh-CN"/>
+              </w:rPr>
+              <w:t>，数据库使用Access。</w:t>
             </w:r>
           </w:p>
           <w:p>
@@ -1378,7 +1430,23 @@
                 <w:rFonts w:ascii="宋体" w:eastAsia="宋体" w:hAnsi="宋体" w:hint="eastAsia"/>
                 <w:lang w:eastAsia="zh-CN"/>
               </w:rPr>
-              <w:t>可选技术栈：</w:t>
+              <w:t>可选技术</w:t>
+            </w:r>
+            <w:proofErr w:type="gramStart"/>
+            <w:r>
+              <w:rPr>
+                <w:rFonts w:ascii="宋体" w:eastAsia="宋体" w:hAnsi="宋体" w:hint="eastAsia"/>
+                <w:lang w:eastAsia="zh-CN"/>
+              </w:rPr>
+              <w:t>栈</w:t>
+            </w:r>
+            <w:proofErr w:type="gramEnd"/>
+            <w:r>
+              <w:rPr>
+                <w:rFonts w:ascii="宋体" w:eastAsia="宋体" w:hAnsi="宋体" w:hint="eastAsia"/>
+                <w:lang w:eastAsia="zh-CN"/>
+              </w:rPr>
+              <w:t>：</w:t>
             </w:r>
           </w:p>
           <w:p>
@@ -1443,7 +1511,39 @@
                 <w:rFonts w:ascii="宋体" w:eastAsia="宋体" w:hAnsi="宋体" w:hint="eastAsia"/>
                 <w:lang w:eastAsia="zh-CN"/>
               </w:rPr>
-              <w:t>- 团队协作与代码管理推荐Gitee (需学习掌握Git)</w:t>
+              <w:t>- 团队协作与代码管理推荐</w:t>
+            </w:r>
+            <w:proofErr w:type="spellStart"/>
+            <w:r>
+              <w:rPr>
+                <w:rFonts w:ascii="宋体" w:eastAsia="宋体" w:hAnsi="宋体" w:hint="eastAsia"/>
+                <w:lang w:eastAsia="zh-CN"/>
+              </w:rPr>
+              <w:t>Gitee</w:t>
+            </w:r>
+            <w:proofErr w:type="spellEnd"/>
+            <w:r>
+              <w:rPr>
+                <w:rFonts w:ascii="宋体" w:eastAsia="宋体" w:hAnsi="宋体" w:hint="eastAsia"/>
+                <w:lang w:eastAsia="zh-CN"/>
+              </w:rPr>
+              <w:t xml:space="preserve"> (</w:t>
+            </w:r>
+            <w:proofErr w:type="gramStart"/>
+            <w:r>
+              <w:rPr>
+                <w:rFonts w:ascii="宋体" w:eastAsia="宋体" w:hAnsi="宋体" w:hint="eastAsia"/>
+                <w:lang w:eastAsia="zh-CN"/>
+              </w:rPr>
+              <w:t>需学习</w:t>
+            </w:r>
+            <w:proofErr w:type="gramEnd"/>
+            <w:r>
+              <w:rPr>
+                <w:rFonts w:ascii="宋体" w:eastAsia="宋体" w:hAnsi="宋体" w:hint="eastAsia"/>
+                <w:lang w:eastAsia="zh-CN"/>
+              </w:rPr>
+              <w:t>掌握Git)</w:t>
             </w:r>
           </w:p>
           <w:p>
@@ -1460,7 +1560,23 @@
                 <w:rFonts w:ascii="宋体" w:eastAsia="宋体" w:hAnsi="宋体" w:hint="eastAsia"/>
                 <w:lang w:eastAsia="zh-CN"/>
               </w:rPr>
-              <w:t>- 项目管理推荐使用Maven或Gradle (需学习Maven或Gradle内容)</w:t>
+              <w:t>- 项目管理推荐使用Maven或Gradle (</w:t>
+            </w:r>
+            <w:proofErr w:type="gramStart"/>
+            <w:r>
+              <w:rPr>
+                <w:rFonts w:ascii="宋体" w:eastAsia="宋体" w:hAnsi="宋体" w:hint="eastAsia"/>
+                <w:lang w:eastAsia="zh-CN"/>
+              </w:rPr>
+              <w:t>需学习</w:t>
+            </w:r>
+            <w:proofErr w:type="gramEnd"/>
+            <w:r>
+              <w:rPr>
+                <w:rFonts w:ascii="宋体" w:eastAsia="宋体" w:hAnsi="宋体" w:hint="eastAsia"/>
+                <w:lang w:eastAsia="zh-CN"/>
+              </w:rPr>
+              <w:t>Maven或Gradle内容)</w:t>
             </w:r>
           </w:p>
           <w:p>
@@ -1477,7 +1593,23 @@
                 <w:rFonts w:ascii="宋体" w:eastAsia="宋体" w:hAnsi="宋体" w:hint="eastAsia"/>
                 <w:lang w:eastAsia="zh-CN"/>
               </w:rPr>
-              <w:t>- 数据库可选支持文件式类型的DB系统，如H2，Sqlite等 (需熟悉对应数据库使用方法)</w:t>
+              <w:t>- 数据库可选支持文件式类型的DB系统，如H2，</w:t>
+            </w:r>
+            <w:proofErr w:type="spellStart"/>
+            <w:r>
+              <w:rPr>
+                <w:rFonts w:ascii="宋体" w:eastAsia="宋体" w:hAnsi="宋体" w:hint="eastAsia"/>
+                <w:lang w:eastAsia="zh-CN"/>
+              </w:rPr>
+              <w:t>Sqlite</w:t>
+            </w:r>
+            <w:proofErr w:type="spellEnd"/>
+            <w:r>
+              <w:rPr>
+                <w:rFonts w:ascii="宋体" w:eastAsia="宋体" w:hAnsi="宋体" w:hint="eastAsia"/>
+                <w:lang w:eastAsia="zh-CN"/>
+              </w:rPr>
+              <w:t>等 (需熟悉对应数据库使用方法)</w:t>
             </w:r>
           </w:p>
           <w:p>
@@ -1834,14 +1966,32 @@
                 <w:color w:val="FF0000"/>
                 <w:lang w:eastAsia="zh-CN"/>
               </w:rPr>
-              <w:t>第三节课</w:t>
-            </w:r>
+              <w:t>第三节</w:t>
+            </w:r>
+            <w:proofErr w:type="gramStart"/>
             <w:r>
               <w:rPr>
                 <w:rFonts w:ascii="宋体" w:eastAsia="宋体" w:hAnsi="宋体" w:hint="eastAsia"/>
-                <w:lang w:eastAsia="zh-CN"/>
-              </w:rPr>
-              <w:t>必须提交小组名单；小组建立后各个组长集中统一开会。</w:t>
+                <w:b/>
+                <w:color w:val="FF0000"/>
+                <w:lang w:eastAsia="zh-CN"/>
+              </w:rPr>
+              <w:t>课</w:t>
+            </w:r>
+            <w:r>
+              <w:rPr>
+                <w:rFonts w:ascii="宋体" w:eastAsia="宋体" w:hAnsi="宋体" w:hint="eastAsia"/>
+                <w:lang w:eastAsia="zh-CN"/>
+              </w:rPr>
+              <w:t>必须</w:t>
+            </w:r>
+            <w:proofErr w:type="gramEnd"/>
+            <w:r>
+              <w:rPr>
+                <w:rFonts w:ascii="宋体" w:eastAsia="宋体" w:hAnsi="宋体" w:hint="eastAsia"/>
+                <w:lang w:eastAsia="zh-CN"/>
+              </w:rPr>
+              <w:t>提交小组名单；小组建立后各个组长集中统一开会。</w:t>
             </w:r>
           </w:p>
           <w:p>
@@ -2148,6 +2298,7 @@
                             </w:rPr>
                             <w:t xml:space="preserve">2 </w:t>
                           </w:r>
+                          <w:proofErr w:type="spellStart"/>
                           <w:r>
                             <w:rPr>
                               <w:rFonts w:ascii="宋体" w:eastAsia="宋体"/>
@@ -2158,6 +2309,7 @@
                             </w:rPr>
                             <w:t>开题讲评</w:t>
                           </w:r>
+                          <w:proofErr w:type="spellEnd"/>
                         </w:p>
                       </w:txbxContent>
                     </v:textbox>
@@ -2318,7 +2470,23 @@
                 <w:rFonts w:ascii="宋体" w:eastAsia="宋体" w:hAnsi="宋体" w:hint="eastAsia"/>
                 <w:lang w:eastAsia="zh-CN"/>
               </w:rPr>
-              <w:t>指定每周小组进度计划并按时提交</w:t>
+              <w:t>指定每</w:t>
+            </w:r>
+            <w:proofErr w:type="gramStart"/>
+            <w:r>
+              <w:rPr>
+                <w:rFonts w:ascii="宋体" w:eastAsia="宋体" w:hAnsi="宋体" w:hint="eastAsia"/>
+                <w:lang w:eastAsia="zh-CN"/>
+              </w:rPr>
+              <w:t>周小组</w:t>
+            </w:r>
+            <w:proofErr w:type="gramEnd"/>
+            <w:r>
+              <w:rPr>
+                <w:rFonts w:ascii="宋体" w:eastAsia="宋体" w:hAnsi="宋体" w:hint="eastAsia"/>
+                <w:lang w:eastAsia="zh-CN"/>
+              </w:rPr>
+              <w:t>进度计划并按时提交</w:t>
             </w:r>
           </w:p>
           <w:p>
@@ -2374,6 +2542,7 @@
               </w:rPr>
               <w:t>系统设计</w:t>
             </w:r>
+            <w:proofErr w:type="gramStart"/>
             <w:r>
               <w:rPr>
                 <w:rFonts w:ascii="宋体" w:eastAsia="宋体" w:hAnsi="宋体"/>
@@ -2386,7 +2555,15 @@
                 <w:rFonts w:ascii="宋体" w:eastAsia="宋体" w:hAnsi="宋体" w:hint="eastAsia"/>
                 <w:lang w:eastAsia="zh-CN"/>
               </w:rPr>
-              <w:t>计划制定</w:t>
+              <w:t>计划</w:t>
+            </w:r>
+            <w:proofErr w:type="gramEnd"/>
+            <w:r>
+              <w:rPr>
+                <w:rFonts w:ascii="宋体" w:eastAsia="宋体" w:hAnsi="宋体" w:hint="eastAsia"/>
+                <w:lang w:eastAsia="zh-CN"/>
+              </w:rPr>
+              <w:t>制定</w:t>
             </w:r>
             <w:r>
               <w:rPr>
@@ -2615,16 +2792,34 @@
               </w:rPr>
               <w:t>分析得出</w:t>
             </w:r>
-            <w:hyperlink w:anchor="_E-R图" w:history="1">
-              <w:r>
-                <w:rPr>
-                  <w:rStyle w:val="af"/>
-                  <w:rFonts w:ascii="宋体" w:eastAsia="宋体" w:hAnsi="宋体" w:hint="eastAsia"/>
-                  <w:lang w:eastAsia="zh-CN"/>
-                </w:rPr>
-                <w:t>E-R图</w:t>
-              </w:r>
-            </w:hyperlink>
+            <w:r>
+              <w:fldChar w:fldCharType="begin"/>
+            </w:r>
+            <w:r>
+              <w:rPr>
+                <w:lang w:eastAsia="zh-CN"/>
+              </w:rPr>
+              <w:instrText xml:space="preserve"> HYPERLINK \l "_E-R图" </w:instrText>
+            </w:r>
+            <w:r>
+              <w:fldChar w:fldCharType="separate"/>
+            </w:r>
+            <w:r>
+              <w:rPr>
+                <w:rStyle w:val="af"/>
+                <w:rFonts w:ascii="宋体" w:eastAsia="宋体" w:hAnsi="宋体" w:hint="eastAsia"/>
+                <w:lang w:eastAsia="zh-CN"/>
+              </w:rPr>
+              <w:t>E-R图</w:t>
+            </w:r>
+            <w:r>
+              <w:rPr>
+                <w:rStyle w:val="af"/>
+                <w:rFonts w:ascii="宋体" w:eastAsia="宋体" w:hAnsi="宋体"/>
+                <w:lang w:eastAsia="zh-CN"/>
+              </w:rPr>
+              <w:fldChar w:fldCharType="end"/>
+            </w:r>
             <w:r>
               <w:rPr>
                 <w:rFonts w:ascii="宋体" w:eastAsia="宋体" w:hAnsi="宋体" w:hint="eastAsia"/>
@@ -2701,7 +2896,23 @@
                 <w:rFonts w:ascii="宋体" w:eastAsia="宋体" w:hAnsi="宋体" w:hint="eastAsia"/>
                 <w:lang w:eastAsia="zh-CN"/>
               </w:rPr>
-              <w:t>分析确定数据库中的字段类型、命名规范(如表名tblUser)等</w:t>
+              <w:t>分析确定数据库中的字段类型、命名规范(如表名</w:t>
+            </w:r>
+            <w:proofErr w:type="spellStart"/>
+            <w:r>
+              <w:rPr>
+                <w:rFonts w:ascii="宋体" w:eastAsia="宋体" w:hAnsi="宋体" w:hint="eastAsia"/>
+                <w:lang w:eastAsia="zh-CN"/>
+              </w:rPr>
+              <w:t>tblUser</w:t>
+            </w:r>
+            <w:proofErr w:type="spellEnd"/>
+            <w:r>
+              <w:rPr>
+                <w:rFonts w:ascii="宋体" w:eastAsia="宋体" w:hAnsi="宋体" w:hint="eastAsia"/>
+                <w:lang w:eastAsia="zh-CN"/>
+              </w:rPr>
+              <w:t>)等</w:t>
             </w:r>
           </w:p>
           <w:p>
@@ -2813,6 +3024,7 @@
                               <w:szCs w:val="36"/>
                             </w:rPr>
                           </w:pPr>
+                          <w:proofErr w:type="gramStart"/>
                           <w:r>
                             <w:rPr>
                               <w:color w:val="9BBB59"/>
@@ -2830,6 +3042,7 @@
                             </w:rPr>
                             <w:t xml:space="preserve">  </w:t>
                           </w:r>
+                          <w:proofErr w:type="spellStart"/>
                           <w:r>
                             <w:rPr>
                               <w:rFonts w:ascii="宋体" w:eastAsia="宋体"/>
@@ -2839,6 +3052,8 @@
                             </w:rPr>
                             <w:t>开发设计</w:t>
                           </w:r>
+                          <w:proofErr w:type="spellEnd"/>
+                          <w:proofErr w:type="gramEnd"/>
                         </w:p>
                       </w:txbxContent>
                     </v:textbox>
@@ -3017,16 +3232,34 @@
               </w:rPr>
               <w:t>遵照</w:t>
             </w:r>
-            <w:hyperlink r:id="rId10" w:history="1">
-              <w:r>
-                <w:rPr>
-                  <w:rStyle w:val="af"/>
-                  <w:rFonts w:ascii="宋体" w:eastAsia="宋体" w:hAnsi="宋体" w:hint="eastAsia"/>
-                  <w:lang w:eastAsia="zh-CN"/>
-                </w:rPr>
-                <w:t>JAVA编码规范</w:t>
-              </w:r>
-            </w:hyperlink>
+            <w:r>
+              <w:fldChar w:fldCharType="begin"/>
+            </w:r>
+            <w:r>
+              <w:rPr>
+                <w:lang w:eastAsia="zh-CN"/>
+              </w:rPr>
+              <w:instrText xml:space="preserve"> HYPERLINK "file:///F:\\2025-26-暑期学校\\计算机学院%20%20专业技能实训（企业）\\常规文档规范\\Java编码规范.doc" </w:instrText>
+            </w:r>
+            <w:r>
+              <w:fldChar w:fldCharType="separate"/>
+            </w:r>
+            <w:r>
+              <w:rPr>
+                <w:rStyle w:val="af"/>
+                <w:rFonts w:ascii="宋体" w:eastAsia="宋体" w:hAnsi="宋体" w:hint="eastAsia"/>
+                <w:lang w:eastAsia="zh-CN"/>
+              </w:rPr>
+              <w:t>JAVA编码规范</w:t>
+            </w:r>
+            <w:r>
+              <w:rPr>
+                <w:rStyle w:val="af"/>
+                <w:rFonts w:ascii="宋体" w:eastAsia="宋体" w:hAnsi="宋体"/>
+                <w:lang w:eastAsia="zh-CN"/>
+              </w:rPr>
+              <w:fldChar w:fldCharType="end"/>
+            </w:r>
             <w:r>
               <w:rPr>
                 <w:rFonts w:ascii="宋体" w:eastAsia="宋体" w:hAnsi="宋体" w:hint="eastAsia"/>
@@ -3136,8 +3369,19 @@
                 <w:color w:val="FF0000"/>
                 <w:lang w:eastAsia="zh-CN"/>
               </w:rPr>
-              <w:t>最终提交程序命名为vCampusClient.jar和vCampusServer.jar[可运行]；数据库名称为vCampus</w:t>
-            </w:r>
+              <w:t>最终提交程序命名为vCampusClient.jar和vCampusServer.jar[可运行]；数据库名称为</w:t>
+            </w:r>
+            <w:proofErr w:type="spellStart"/>
+            <w:r>
+              <w:rPr>
+                <w:rFonts w:ascii="宋体" w:eastAsia="宋体" w:hAnsi="宋体" w:hint="eastAsia"/>
+                <w:b/>
+                <w:color w:val="FF0000"/>
+                <w:lang w:eastAsia="zh-CN"/>
+              </w:rPr>
+              <w:t>vCampus</w:t>
+            </w:r>
+            <w:proofErr w:type="spellEnd"/>
           </w:p>
           <w:p>
             <w:pPr>
@@ -3183,16 +3427,34 @@
               </w:rPr>
               <w:t>山寨QQ。</w:t>
             </w:r>
-            <w:hyperlink r:id="rId11" w:history="1">
-              <w:r>
-                <w:rPr>
-                  <w:rStyle w:val="af"/>
-                  <w:rFonts w:ascii="宋体" w:eastAsia="宋体" w:hAnsi="宋体" w:hint="eastAsia"/>
-                  <w:lang w:eastAsia="zh-CN"/>
-                </w:rPr>
-                <w:t>JAVA编程常见问题集锦</w:t>
-              </w:r>
-            </w:hyperlink>
+            <w:r>
+              <w:fldChar w:fldCharType="begin"/>
+            </w:r>
+            <w:r>
+              <w:rPr>
+                <w:lang w:eastAsia="zh-CN"/>
+              </w:rPr>
+              <w:instrText xml:space="preserve"> HYPERLINK "file:///F:\\2025-26-暑期学校\\计算机学院%20%20专业技能实训（企业）\\JAVA编程常见问题集锦.docx" </w:instrText>
+            </w:r>
+            <w:r>
+              <w:fldChar w:fldCharType="separate"/>
+            </w:r>
+            <w:r>
+              <w:rPr>
+                <w:rStyle w:val="af"/>
+                <w:rFonts w:ascii="宋体" w:eastAsia="宋体" w:hAnsi="宋体" w:hint="eastAsia"/>
+                <w:lang w:eastAsia="zh-CN"/>
+              </w:rPr>
+              <w:t>JAVA编程常见问题集锦</w:t>
+            </w:r>
+            <w:r>
+              <w:rPr>
+                <w:rStyle w:val="af"/>
+                <w:rFonts w:ascii="宋体" w:eastAsia="宋体" w:hAnsi="宋体"/>
+                <w:lang w:eastAsia="zh-CN"/>
+              </w:rPr>
+              <w:fldChar w:fldCharType="end"/>
+            </w:r>
             <w:r>
               <w:rPr>
                 <w:rFonts w:ascii="宋体" w:eastAsia="宋体" w:hAnsi="宋体" w:hint="eastAsia"/>
@@ -3829,6 +4091,7 @@
               </w:rPr>
               <w:t>部署</w:t>
             </w:r>
+            <w:proofErr w:type="gramStart"/>
             <w:r>
               <w:rPr>
                 <w:rFonts w:ascii="宋体" w:eastAsia="宋体" w:hAnsi="宋体"/>
@@ -3869,7 +4132,15 @@
                 <w:rFonts w:ascii="宋体" w:eastAsia="宋体" w:hAnsi="宋体" w:hint="eastAsia"/>
                 <w:lang w:eastAsia="zh-CN"/>
               </w:rPr>
-              <w:t>正常/容错</w:t>
+              <w:t>正常</w:t>
+            </w:r>
+            <w:proofErr w:type="gramEnd"/>
+            <w:r>
+              <w:rPr>
+                <w:rFonts w:ascii="宋体" w:eastAsia="宋体" w:hAnsi="宋体" w:hint="eastAsia"/>
+                <w:lang w:eastAsia="zh-CN"/>
+              </w:rPr>
+              <w:t>/容错</w:t>
             </w:r>
           </w:p>
           <w:p>
@@ -4003,8 +4274,17 @@
           <w:rFonts w:ascii="宋体" w:eastAsia="宋体" w:hAnsi="宋体" w:hint="eastAsia"/>
           <w:lang w:eastAsia="zh-CN"/>
         </w:rPr>
-        <w:t>分解任务并执行---TestCase</w:t>
-      </w:r>
+        <w:t>分解任务并执行---</w:t>
+      </w:r>
+      <w:proofErr w:type="spellStart"/>
+      <w:r>
+        <w:rPr>
+          <w:rFonts w:ascii="宋体" w:eastAsia="宋体" w:hAnsi="宋体" w:hint="eastAsia"/>
+          <w:lang w:eastAsia="zh-CN"/>
+        </w:rPr>
+        <w:t>TestCase</w:t>
+      </w:r>
+      <w:proofErr w:type="spellEnd"/>
     </w:p>
     <w:p>
       <w:pPr>
@@ -4342,8 +4622,17 @@
                 <w:rFonts w:ascii="宋体" w:eastAsia="宋体" w:hAnsi="宋体" w:hint="eastAsia"/>
                 <w:lang w:eastAsia="zh-CN"/>
               </w:rPr>
-              <w:t>biz/srv</w:t>
-            </w:r>
+              <w:t>biz/</w:t>
+            </w:r>
+            <w:proofErr w:type="spellStart"/>
+            <w:r>
+              <w:rPr>
+                <w:rFonts w:ascii="宋体" w:eastAsia="宋体" w:hAnsi="宋体" w:hint="eastAsia"/>
+                <w:lang w:eastAsia="zh-CN"/>
+              </w:rPr>
+              <w:t>srv</w:t>
+            </w:r>
+            <w:proofErr w:type="spellEnd"/>
           </w:p>
         </w:tc>
         <w:tc>
@@ -4404,13 +4693,31 @@
                 <w:lang w:eastAsia="zh-CN"/>
               </w:rPr>
             </w:pPr>
+            <w:proofErr w:type="spellStart"/>
             <w:r>
               <w:rPr>
                 <w:rFonts w:ascii="宋体" w:eastAsia="宋体" w:hAnsi="宋体" w:hint="eastAsia"/>
                 <w:lang w:eastAsia="zh-CN"/>
               </w:rPr>
-              <w:t>vo/domain/pojo</w:t>
-            </w:r>
+              <w:t>vo</w:t>
+            </w:r>
+            <w:proofErr w:type="spellEnd"/>
+            <w:r>
+              <w:rPr>
+                <w:rFonts w:ascii="宋体" w:eastAsia="宋体" w:hAnsi="宋体" w:hint="eastAsia"/>
+                <w:lang w:eastAsia="zh-CN"/>
+              </w:rPr>
+              <w:t>/domain/</w:t>
+            </w:r>
+            <w:proofErr w:type="spellStart"/>
+            <w:r>
+              <w:rPr>
+                <w:rFonts w:ascii="宋体" w:eastAsia="宋体" w:hAnsi="宋体" w:hint="eastAsia"/>
+                <w:lang w:eastAsia="zh-CN"/>
+              </w:rPr>
+              <w:t>pojo</w:t>
+            </w:r>
+            <w:proofErr w:type="spellEnd"/>
           </w:p>
         </w:tc>
         <w:tc>
@@ -4471,6 +4778,7 @@
                 <w:lang w:eastAsia="zh-CN"/>
               </w:rPr>
             </w:pPr>
+            <w:proofErr w:type="spellStart"/>
             <w:r>
               <w:rPr>
                 <w:rFonts w:ascii="宋体" w:eastAsia="宋体" w:hAnsi="宋体" w:hint="eastAsia"/>
@@ -4478,6 +4786,7 @@
               </w:rPr>
               <w:t>dao</w:t>
             </w:r>
+            <w:proofErr w:type="spellEnd"/>
           </w:p>
         </w:tc>
         <w:tc>
@@ -4569,14 +4878,48 @@
           <w:bCs/>
           <w:lang w:eastAsia="zh-CN"/>
         </w:rPr>
-        <w:t>线程管理池</w:t>
-      </w:r>
+        <w:t>线程管理</w:t>
+      </w:r>
+      <w:proofErr w:type="gramStart"/>
       <w:r>
         <w:rPr>
           <w:rFonts w:ascii="宋体" w:eastAsia="宋体" w:hAnsi="宋体" w:hint="eastAsia"/>
-          <w:lang w:eastAsia="zh-CN"/>
-        </w:rPr>
-        <w:t>用于维护当前连接的客户端；Map&lt;String, ClientThread&gt;</w:t>
+          <w:b/>
+          <w:bCs/>
+          <w:lang w:eastAsia="zh-CN"/>
+        </w:rPr>
+        <w:t>池</w:t>
+      </w:r>
+      <w:r>
+        <w:rPr>
+          <w:rFonts w:ascii="宋体" w:eastAsia="宋体" w:hAnsi="宋体" w:hint="eastAsia"/>
+          <w:lang w:eastAsia="zh-CN"/>
+        </w:rPr>
+        <w:t>用于</w:t>
+      </w:r>
+      <w:proofErr w:type="gramEnd"/>
+      <w:r>
+        <w:rPr>
+          <w:rFonts w:ascii="宋体" w:eastAsia="宋体" w:hAnsi="宋体" w:hint="eastAsia"/>
+          <w:lang w:eastAsia="zh-CN"/>
+        </w:rPr>
+        <w:t xml:space="preserve">维护当前连接的客户端；Map&lt;String, </w:t>
+      </w:r>
+      <w:proofErr w:type="spellStart"/>
+      <w:r>
+        <w:rPr>
+          <w:rFonts w:ascii="宋体" w:eastAsia="宋体" w:hAnsi="宋体" w:hint="eastAsia"/>
+          <w:lang w:eastAsia="zh-CN"/>
+        </w:rPr>
+        <w:t>ClientThread</w:t>
+      </w:r>
+      <w:proofErr w:type="spellEnd"/>
+      <w:r>
+        <w:rPr>
+          <w:rFonts w:ascii="宋体" w:eastAsia="宋体" w:hAnsi="宋体" w:hint="eastAsia"/>
+          <w:lang w:eastAsia="zh-CN"/>
+        </w:rPr>
+        <w:t>&gt;</w:t>
       </w:r>
     </w:p>
     <w:p>
@@ -4616,7 +4959,23 @@
           <w:rFonts w:ascii="宋体" w:eastAsia="宋体" w:hAnsi="宋体" w:hint="eastAsia"/>
           <w:lang w:eastAsia="zh-CN"/>
         </w:rPr>
-        <w:t>所有需要传输的对象必须实现可序列化接口；必须保持客户端与服务器端类的一致性</w:t>
+        <w:t>所有需要传输的对象必须实现可序列化接口；必须保持客户端与</w:t>
+      </w:r>
+      <w:proofErr w:type="gramStart"/>
+      <w:r>
+        <w:rPr>
+          <w:rFonts w:ascii="宋体" w:eastAsia="宋体" w:hAnsi="宋体" w:hint="eastAsia"/>
+          <w:lang w:eastAsia="zh-CN"/>
+        </w:rPr>
+        <w:t>服务器端类的</w:t>
+      </w:r>
+      <w:proofErr w:type="gramEnd"/>
+      <w:r>
+        <w:rPr>
+          <w:rFonts w:ascii="宋体" w:eastAsia="宋体" w:hAnsi="宋体" w:hint="eastAsia"/>
+          <w:lang w:eastAsia="zh-CN"/>
+        </w:rPr>
+        <w:t>一致性</w:t>
       </w:r>
     </w:p>
     <w:p>
@@ -4676,7 +5035,23 @@
           <w:rFonts w:ascii="宋体" w:eastAsia="宋体" w:hAnsi="宋体" w:hint="eastAsia"/>
           <w:lang w:eastAsia="zh-CN"/>
         </w:rPr>
-        <w:t>基于Git、CVS或SVN； oschina, 开源中国</w:t>
+        <w:t xml:space="preserve">基于Git、CVS或SVN； </w:t>
+      </w:r>
+      <w:proofErr w:type="spellStart"/>
+      <w:r>
+        <w:rPr>
+          <w:rFonts w:ascii="宋体" w:eastAsia="宋体" w:hAnsi="宋体" w:hint="eastAsia"/>
+          <w:lang w:eastAsia="zh-CN"/>
+        </w:rPr>
+        <w:t>oschina</w:t>
+      </w:r>
+      <w:proofErr w:type="spellEnd"/>
+      <w:r>
+        <w:rPr>
+          <w:rFonts w:ascii="宋体" w:eastAsia="宋体" w:hAnsi="宋体" w:hint="eastAsia"/>
+          <w:lang w:eastAsia="zh-CN"/>
+        </w:rPr>
+        <w:t>, 开源中国</w:t>
       </w:r>
     </w:p>
     <w:p>
@@ -4840,6 +5215,7 @@
                       <w:spacing w:before="0" w:beforeAutospacing="0" w:after="0" w:afterAutospacing="0"/>
                       <w:textAlignment w:val="baseline"/>
                     </w:pPr>
+                    <w:proofErr w:type="spellStart"/>
                     <w:r>
                       <w:rPr>
                         <w:rFonts w:ascii="Arial" w:hAnsi="Arial"/>
@@ -4848,7 +5224,18 @@
                         <w:color w:val="000000"/>
                         <w:kern w:val="24"/>
                       </w:rPr>
-                      <w:t xml:space="preserve">uid : String // </w:t>
+                      <w:t>uid</w:t>
+                    </w:r>
+                    <w:proofErr w:type="spellEnd"/>
+                    <w:r>
+                      <w:rPr>
+                        <w:rFonts w:ascii="Arial" w:hAnsi="Arial"/>
+                        <w:b/>
+                        <w:bCs/>
+                        <w:color w:val="000000"/>
+                        <w:kern w:val="24"/>
+                      </w:rPr>
+                      <w:t xml:space="preserve"> : String // </w:t>
                     </w:r>
                     <w:r>
                       <w:rPr>
@@ -5007,6 +5394,8 @@
                       <w:spacing w:before="0" w:beforeAutospacing="0" w:after="0" w:afterAutospacing="0"/>
                       <w:textAlignment w:val="baseline"/>
                     </w:pPr>
+                    <w:proofErr w:type="spellStart"/>
+                    <w:proofErr w:type="gramStart"/>
                     <w:r>
                       <w:rPr>
                         <w:rFonts w:ascii="Calibri" w:hAnsi="Calibri"/>
@@ -5017,6 +5406,8 @@
                       </w:rPr>
                       <w:t>java.io.Serializable</w:t>
                     </w:r>
+                    <w:proofErr w:type="spellEnd"/>
+                    <w:proofErr w:type="gramEnd"/>
                   </w:p>
                 </w:txbxContent>
               </v:textbox>
@@ -5119,6 +5510,7 @@
         </w:rPr>
         <w:t>需求分析与软件设计</w:t>
       </w:r>
+      <w:proofErr w:type="gramStart"/>
       <w:r>
         <w:rPr>
           <w:rFonts w:ascii="宋体" w:eastAsia="宋体" w:hAnsi="宋体"/>
@@ -5131,7 +5523,15 @@
           <w:rFonts w:ascii="宋体" w:eastAsia="宋体" w:hAnsi="宋体" w:hint="eastAsia"/>
           <w:lang w:eastAsia="zh-CN"/>
         </w:rPr>
-        <w:t>程序编制</w:t>
+        <w:t>程序</w:t>
+      </w:r>
+      <w:proofErr w:type="gramEnd"/>
+      <w:r>
+        <w:rPr>
+          <w:rFonts w:ascii="宋体" w:eastAsia="宋体" w:hAnsi="宋体" w:hint="eastAsia"/>
+          <w:lang w:eastAsia="zh-CN"/>
+        </w:rPr>
+        <w:t>编制</w:t>
       </w:r>
       <w:r>
         <w:rPr>
@@ -5299,8 +5699,18 @@
           <w:sz w:val="24"/>
           <w:lang w:eastAsia="zh-CN"/>
         </w:rPr>
-        <w:t>2. 系统分析</w:t>
-      </w:r>
+        <w:t xml:space="preserve">2. </w:t>
+      </w:r>
+      <w:proofErr w:type="spellStart"/>
+      <w:r>
+        <w:rPr>
+          <w:rFonts w:ascii="宋体" w:hAnsi="宋体" w:hint="eastAsia"/>
+          <w:sz w:val="24"/>
+          <w:lang w:eastAsia="zh-CN"/>
+        </w:rPr>
+        <w:t>系统分析</w:t>
+      </w:r>
+      <w:proofErr w:type="spellEnd"/>
     </w:p>
     <w:p>
       <w:pPr>
@@ -5320,8 +5730,18 @@
           <w:sz w:val="24"/>
           <w:lang w:eastAsia="zh-CN"/>
         </w:rPr>
-        <w:t>1) 可行性分析</w:t>
-      </w:r>
+        <w:t xml:space="preserve">1) </w:t>
+      </w:r>
+      <w:proofErr w:type="spellStart"/>
+      <w:r>
+        <w:rPr>
+          <w:rFonts w:ascii="宋体" w:hAnsi="宋体" w:hint="eastAsia"/>
+          <w:sz w:val="24"/>
+          <w:lang w:eastAsia="zh-CN"/>
+        </w:rPr>
+        <w:t>可行性分析</w:t>
+      </w:r>
+      <w:proofErr w:type="spellEnd"/>
     </w:p>
     <w:p>
       <w:pPr>
@@ -5362,8 +5782,18 @@
           <w:sz w:val="24"/>
           <w:lang w:eastAsia="zh-CN"/>
         </w:rPr>
-        <w:t>2) 需求分析</w:t>
-      </w:r>
+        <w:t xml:space="preserve">2) </w:t>
+      </w:r>
+      <w:proofErr w:type="spellStart"/>
+      <w:r>
+        <w:rPr>
+          <w:rFonts w:ascii="宋体" w:hAnsi="宋体" w:hint="eastAsia"/>
+          <w:sz w:val="24"/>
+          <w:lang w:eastAsia="zh-CN"/>
+        </w:rPr>
+        <w:t>需求分析</w:t>
+      </w:r>
+      <w:proofErr w:type="spellEnd"/>
     </w:p>
     <w:p>
       <w:pPr>
@@ -5377,14 +5807,34 @@
           <w:lang w:eastAsia="zh-CN"/>
         </w:rPr>
       </w:pPr>
+      <w:proofErr w:type="spellStart"/>
       <w:r>
         <w:rPr>
           <w:rFonts w:ascii="宋体" w:hAnsi="宋体" w:hint="eastAsia"/>
           <w:sz w:val="24"/>
           <w:lang w:eastAsia="zh-CN"/>
         </w:rPr>
-        <w:t>选课工作要完成选课输入/输出、选课查询、成绩查询、改选课等功能</w:t>
-      </w:r>
+        <w:t>选课工作要完成选课输入</w:t>
+      </w:r>
+      <w:proofErr w:type="spellEnd"/>
+      <w:r>
+        <w:rPr>
+          <w:rFonts w:ascii="宋体" w:hAnsi="宋体" w:hint="eastAsia"/>
+          <w:sz w:val="24"/>
+          <w:lang w:eastAsia="zh-CN"/>
+        </w:rPr>
+        <w:t>/</w:t>
+      </w:r>
+      <w:proofErr w:type="spellStart"/>
+      <w:r>
+        <w:rPr>
+          <w:rFonts w:ascii="宋体" w:hAnsi="宋体" w:hint="eastAsia"/>
+          <w:sz w:val="24"/>
+          <w:lang w:eastAsia="zh-CN"/>
+        </w:rPr>
+        <w:t>输出、选课查询、成绩查询、改选课等功能</w:t>
+      </w:r>
+      <w:proofErr w:type="spellEnd"/>
     </w:p>
     <w:p>
       <w:pPr>
@@ -5402,7 +5852,15 @@
           <w:rFonts w:hint="eastAsia"/>
         </w:rPr>
         <w:lastRenderedPageBreak/>
-        <w:t>E-R</w:t>
+        <w:t>E-</w:t>
+      </w:r>
+      <w:proofErr w:type="spellStart"/>
+      <w:r>
+        <w:rPr>
+          <w:rStyle w:val="ad"/>
+          <w:rFonts w:hint="eastAsia"/>
+        </w:rPr>
+        <w:t>R</w:t>
       </w:r>
       <w:r>
         <w:rPr>
@@ -5412,6 +5870,7 @@
         <w:t>图</w:t>
       </w:r>
       <w:bookmarkEnd w:id="19"/>
+      <w:proofErr w:type="spellEnd"/>
     </w:p>
     <w:p>
       <w:pPr>
@@ -5442,7 +5901,7 @@
             <o:lock v:ext="edit" aspectratio="t"/>
           </v:shapetype>
           <v:shape id="_x0000_i1030" type="#_x0000_t75" style="width:385.5pt;height:226.5pt">
-            <v:imagedata r:id="rId12" o:title=""/>
+            <v:imagedata r:id="rId10" o:title=""/>
           </v:shape>
         </w:pict>
       </w:r>
@@ -5453,12 +5912,21 @@
           <w:lang w:eastAsia="zh-CN"/>
         </w:rPr>
       </w:pPr>
+      <w:proofErr w:type="spellStart"/>
       <w:r>
         <w:rPr>
           <w:rFonts w:hint="eastAsia"/>
           <w:lang w:eastAsia="zh-CN"/>
         </w:rPr>
-        <w:t>问题：</w:t>
+        <w:t>问题</w:t>
+      </w:r>
+      <w:proofErr w:type="spellEnd"/>
+      <w:r>
+        <w:rPr>
+          <w:rFonts w:hint="eastAsia"/>
+          <w:lang w:eastAsia="zh-CN"/>
+        </w:rPr>
+        <w:t>：</w:t>
       </w:r>
     </w:p>
     <w:p>
@@ -5740,12 +6208,14 @@
       </w:pPr>
     </w:p>
     <w:p>
+      <w:proofErr w:type="spellStart"/>
       <w:r>
         <w:rPr>
           <w:rFonts w:hint="eastAsia"/>
         </w:rPr>
         <w:t>数据字典</w:t>
       </w:r>
+      <w:proofErr w:type="spellEnd"/>
     </w:p>
     <w:p>
       <w:pPr>
@@ -5757,6 +6227,8 @@
         </w:rPr>
         <w:t xml:space="preserve"> </w:t>
       </w:r>
+      <w:proofErr w:type="spellStart"/>
+      <w:proofErr w:type="gramStart"/>
       <w:r>
         <w:t>D</w:t>
       </w:r>
@@ -5764,73 +6236,199 @@
         <w:rPr>
           <w:rFonts w:hint="eastAsia"/>
         </w:rPr>
-        <w:t>epartment:部门；deptid:部门号；deptname:部门名称；</w:t>
+        <w:t>epartment:部门</w:t>
+      </w:r>
+      <w:proofErr w:type="gramEnd"/>
+      <w:r>
+        <w:rPr>
+          <w:rFonts w:hint="eastAsia"/>
+        </w:rPr>
+        <w:t>；deptid:部门号；deptname:部门名称</w:t>
+      </w:r>
+      <w:proofErr w:type="spellEnd"/>
+      <w:r>
+        <w:rPr>
+          <w:rFonts w:hint="eastAsia"/>
+        </w:rPr>
+        <w:t>；</w:t>
       </w:r>
     </w:p>
     <w:p>
       <w:pPr>
         <w:ind w:firstLineChars="150" w:firstLine="330"/>
       </w:pPr>
+      <w:proofErr w:type="spellStart"/>
+      <w:proofErr w:type="gramStart"/>
       <w:r>
         <w:rPr>
           <w:rFonts w:hint="eastAsia"/>
         </w:rPr>
-        <w:t>teacher:教师tid:教师编号；sex:性别；tname:姓名；technical:职称；</w:t>
+        <w:t>teacher:教师</w:t>
+      </w:r>
+      <w:proofErr w:type="gramEnd"/>
+      <w:r>
+        <w:rPr>
+          <w:rFonts w:hint="eastAsia"/>
+        </w:rPr>
+        <w:t>tid:教师编号；sex:性别；tname:姓名；technical:职称</w:t>
+      </w:r>
+      <w:proofErr w:type="spellEnd"/>
+      <w:r>
+        <w:rPr>
+          <w:rFonts w:hint="eastAsia"/>
+        </w:rPr>
+        <w:t>；</w:t>
       </w:r>
     </w:p>
     <w:p>
       <w:pPr>
         <w:ind w:firstLineChars="150" w:firstLine="330"/>
       </w:pPr>
+      <w:proofErr w:type="spellStart"/>
+      <w:proofErr w:type="gramStart"/>
       <w:r>
         <w:rPr>
           <w:rFonts w:hint="eastAsia"/>
         </w:rPr>
-        <w:t>subject:课程；subjid:课程号；date:开课日期；subjname:课程名；num:学时数；credit:学分</w:t>
-      </w:r>
+        <w:t>subject:课程</w:t>
+      </w:r>
+      <w:proofErr w:type="gramEnd"/>
+      <w:r>
+        <w:rPr>
+          <w:rFonts w:hint="eastAsia"/>
+        </w:rPr>
+        <w:t>；subjid:课程号；date:开课日期；subjname:课程名；num:学时数；credit:学分</w:t>
+      </w:r>
+      <w:proofErr w:type="spellEnd"/>
     </w:p>
     <w:p>
       <w:pPr>
         <w:ind w:firstLineChars="150" w:firstLine="330"/>
       </w:pPr>
+      <w:proofErr w:type="spellStart"/>
+      <w:proofErr w:type="gramStart"/>
       <w:r>
         <w:rPr>
           <w:rFonts w:hint="eastAsia"/>
         </w:rPr>
-        <w:t>class:班级；cid:班级代码；cname:班级名称；expername:专业名称；</w:t>
+        <w:t>class:班级</w:t>
+      </w:r>
+      <w:proofErr w:type="gramEnd"/>
+      <w:r>
+        <w:rPr>
+          <w:rFonts w:hint="eastAsia"/>
+        </w:rPr>
+        <w:t>；cid:班级代码；cname:班级名称；expername:专业名称</w:t>
+      </w:r>
+      <w:proofErr w:type="spellEnd"/>
+      <w:r>
+        <w:rPr>
+          <w:rFonts w:hint="eastAsia"/>
+        </w:rPr>
+        <w:t>；</w:t>
       </w:r>
     </w:p>
     <w:p>
       <w:pPr>
         <w:ind w:firstLineChars="150" w:firstLine="330"/>
       </w:pPr>
+      <w:proofErr w:type="spellStart"/>
+      <w:proofErr w:type="gramStart"/>
       <w:r>
         <w:rPr>
           <w:rFonts w:hint="eastAsia"/>
         </w:rPr>
-        <w:t>student:学生；sid:学号，sname:姓名； sex:性别；email 邮件;idCard身份</w:t>
-      </w:r>
+        <w:t>student:学生</w:t>
+      </w:r>
+      <w:proofErr w:type="gramEnd"/>
+      <w:r>
+        <w:rPr>
+          <w:rFonts w:hint="eastAsia"/>
+        </w:rPr>
+        <w:t>；sid:学号，sname:姓名</w:t>
+      </w:r>
+      <w:proofErr w:type="spellEnd"/>
+      <w:r>
+        <w:rPr>
+          <w:rFonts w:hint="eastAsia"/>
+        </w:rPr>
+        <w:t xml:space="preserve">； </w:t>
+      </w:r>
+      <w:proofErr w:type="spellStart"/>
+      <w:r>
+        <w:rPr>
+          <w:rFonts w:hint="eastAsia"/>
+        </w:rPr>
+        <w:t>sex:性别；email</w:t>
+      </w:r>
+      <w:proofErr w:type="spellEnd"/>
+      <w:r>
+        <w:rPr>
+          <w:rFonts w:hint="eastAsia"/>
+        </w:rPr>
+        <w:t xml:space="preserve"> </w:t>
+      </w:r>
+      <w:proofErr w:type="spellStart"/>
+      <w:r>
+        <w:rPr>
+          <w:rFonts w:hint="eastAsia"/>
+        </w:rPr>
+        <w:t>邮件;idCard身份</w:t>
+      </w:r>
+      <w:proofErr w:type="spellEnd"/>
     </w:p>
     <w:p>
       <w:pPr>
         <w:ind w:firstLineChars="150" w:firstLine="330"/>
       </w:pPr>
+      <w:proofErr w:type="spellStart"/>
+      <w:proofErr w:type="gramStart"/>
       <w:r>
         <w:rPr>
           <w:rFonts w:hint="eastAsia"/>
         </w:rPr>
-        <w:t>choose:选课；selectid:选课号；</w:t>
+        <w:t>choose:选课</w:t>
+      </w:r>
+      <w:proofErr w:type="gramEnd"/>
+      <w:r>
+        <w:rPr>
+          <w:rFonts w:hint="eastAsia"/>
+        </w:rPr>
+        <w:t>；selectid:选课号</w:t>
+      </w:r>
+      <w:proofErr w:type="spellEnd"/>
+      <w:r>
+        <w:rPr>
+          <w:rFonts w:hint="eastAsia"/>
+        </w:rPr>
+        <w:t>；</w:t>
       </w:r>
     </w:p>
     <w:p>
       <w:pPr>
         <w:ind w:firstLineChars="150" w:firstLine="330"/>
       </w:pPr>
+      <w:proofErr w:type="spellStart"/>
+      <w:proofErr w:type="gramStart"/>
       <w:r>
         <w:rPr>
           <w:rFonts w:hint="eastAsia"/>
         </w:rPr>
-        <w:t>exam:考试；examdate:考试日期；score:成绩；</w:t>
+        <w:t>exam:考试</w:t>
+      </w:r>
+      <w:proofErr w:type="gramEnd"/>
+      <w:r>
+        <w:rPr>
+          <w:rFonts w:hint="eastAsia"/>
+        </w:rPr>
+        <w:t>；examdate:考试日期；score:成绩</w:t>
+      </w:r>
+      <w:proofErr w:type="spellEnd"/>
+      <w:r>
+        <w:rPr>
+          <w:rFonts w:hint="eastAsia"/>
+        </w:rPr>
+        <w:t>；</w:t>
       </w:r>
     </w:p>
     <w:p>
@@ -6042,8 +6640,17 @@
           <w:rFonts w:ascii="宋体" w:hAnsi="宋体" w:hint="eastAsia"/>
           <w:lang w:eastAsia="zh-CN"/>
         </w:rPr>
-        <w:t>（第一个为组长，组长可以</w:t>
-      </w:r>
+        <w:t>（</w:t>
+      </w:r>
+      <w:proofErr w:type="spellStart"/>
+      <w:r>
+        <w:rPr>
+          <w:rFonts w:ascii="宋体" w:hAnsi="宋体" w:hint="eastAsia"/>
+          <w:lang w:eastAsia="zh-CN"/>
+        </w:rPr>
+        <w:t>第一个为组长，组长可以</w:t>
+      </w:r>
+      <w:proofErr w:type="spellEnd"/>
       <w:r>
         <w:rPr>
           <w:rFonts w:ascii="宋体" w:eastAsia="宋体" w:hAnsi="宋体" w:hint="eastAsia"/>
@@ -6051,12 +6658,21 @@
         </w:rPr>
         <w:t>有权建议</w:t>
       </w:r>
+      <w:proofErr w:type="spellStart"/>
       <w:r>
         <w:rPr>
           <w:rFonts w:ascii="宋体" w:hAnsi="宋体" w:hint="eastAsia"/>
           <w:lang w:eastAsia="zh-CN"/>
         </w:rPr>
-        <w:t>组员离开他的团队）</w:t>
+        <w:t>组员离开他的团队</w:t>
+      </w:r>
+      <w:proofErr w:type="spellEnd"/>
+      <w:r>
+        <w:rPr>
+          <w:rFonts w:ascii="宋体" w:hAnsi="宋体" w:hint="eastAsia"/>
+          <w:lang w:eastAsia="zh-CN"/>
+        </w:rPr>
+        <w:t>）</w:t>
       </w:r>
       <w:r>
         <w:rPr>
@@ -6114,6 +6730,7 @@
                 <w:b/>
               </w:rPr>
             </w:pPr>
+            <w:proofErr w:type="spellStart"/>
             <w:r>
               <w:rPr>
                 <w:rFonts w:ascii="宋体" w:hAnsi="宋体" w:hint="eastAsia"/>
@@ -6121,6 +6738,7 @@
               </w:rPr>
               <w:t>组号</w:t>
             </w:r>
+            <w:proofErr w:type="spellEnd"/>
           </w:p>
         </w:tc>
         <w:tc>
@@ -6160,6 +6778,7 @@
                 <w:b/>
               </w:rPr>
             </w:pPr>
+            <w:proofErr w:type="spellStart"/>
             <w:r>
               <w:rPr>
                 <w:rFonts w:ascii="宋体" w:hAnsi="宋体" w:hint="eastAsia"/>
@@ -6167,6 +6786,7 @@
               </w:rPr>
               <w:t>姓名</w:t>
             </w:r>
+            <w:proofErr w:type="spellEnd"/>
           </w:p>
         </w:tc>
         <w:tc>
@@ -6182,6 +6802,7 @@
                 <w:b/>
               </w:rPr>
             </w:pPr>
+            <w:proofErr w:type="spellStart"/>
             <w:r>
               <w:rPr>
                 <w:rFonts w:ascii="宋体" w:hAnsi="宋体" w:hint="eastAsia"/>
@@ -6189,6 +6810,7 @@
               </w:rPr>
               <w:t>职务</w:t>
             </w:r>
+            <w:proofErr w:type="spellEnd"/>
           </w:p>
         </w:tc>
         <w:tc>
@@ -6204,6 +6826,7 @@
                 <w:b/>
               </w:rPr>
             </w:pPr>
+            <w:proofErr w:type="spellStart"/>
             <w:r>
               <w:rPr>
                 <w:rFonts w:ascii="宋体" w:hAnsi="宋体" w:hint="eastAsia"/>
@@ -6211,6 +6834,7 @@
               </w:rPr>
               <w:t>具体工作</w:t>
             </w:r>
+            <w:proofErr w:type="spellEnd"/>
           </w:p>
         </w:tc>
         <w:tc>
@@ -7173,6 +7797,7 @@
                 <w:b/>
               </w:rPr>
             </w:pPr>
+            <w:proofErr w:type="spellStart"/>
             <w:r>
               <w:rPr>
                 <w:rFonts w:ascii="宋体" w:hAnsi="宋体" w:hint="eastAsia"/>
@@ -7180,6 +7805,7 @@
               </w:rPr>
               <w:t>组号</w:t>
             </w:r>
+            <w:proofErr w:type="spellEnd"/>
           </w:p>
         </w:tc>
         <w:tc>
@@ -7219,6 +7845,7 @@
                 <w:b/>
               </w:rPr>
             </w:pPr>
+            <w:proofErr w:type="spellStart"/>
             <w:r>
               <w:rPr>
                 <w:rFonts w:ascii="宋体" w:hAnsi="宋体" w:hint="eastAsia"/>
@@ -7226,6 +7853,7 @@
               </w:rPr>
               <w:t>姓名</w:t>
             </w:r>
+            <w:proofErr w:type="spellEnd"/>
           </w:p>
         </w:tc>
         <w:tc>
@@ -7241,6 +7869,7 @@
                 <w:b/>
               </w:rPr>
             </w:pPr>
+            <w:proofErr w:type="spellStart"/>
             <w:r>
               <w:rPr>
                 <w:rFonts w:ascii="宋体" w:hAnsi="宋体" w:hint="eastAsia"/>
@@ -7248,6 +7877,7 @@
               </w:rPr>
               <w:t>职务</w:t>
             </w:r>
+            <w:proofErr w:type="spellEnd"/>
           </w:p>
         </w:tc>
         <w:tc>
@@ -7263,6 +7893,7 @@
                 <w:b/>
               </w:rPr>
             </w:pPr>
+            <w:proofErr w:type="spellStart"/>
             <w:r>
               <w:rPr>
                 <w:rFonts w:ascii="宋体" w:hAnsi="宋体" w:hint="eastAsia"/>
@@ -7270,6 +7901,7 @@
               </w:rPr>
               <w:t>具体工作</w:t>
             </w:r>
+            <w:proofErr w:type="spellEnd"/>
           </w:p>
         </w:tc>
         <w:tc>
@@ -9510,6 +10142,7 @@
                 <w:lang w:eastAsia="zh-CN"/>
               </w:rPr>
             </w:pPr>
+            <w:proofErr w:type="spellStart"/>
             <w:r>
               <w:rPr>
                 <w:rFonts w:hint="eastAsia"/>
@@ -9521,6 +10154,7 @@
               </w:rPr>
               <w:t>现场检查各组具体完成的每周阶段目标</w:t>
             </w:r>
+            <w:proofErr w:type="spellEnd"/>
           </w:p>
         </w:tc>
       </w:tr>
@@ -10219,19 +10853,40 @@
               </w:rPr>
               <w:t>各组提交</w:t>
             </w:r>
-            <w:hyperlink w:anchor="_组间互评表（邮件发送至shen.list@seu.edu.cn）" w:history="1">
-              <w:r>
-                <w:rPr>
-                  <w:rStyle w:val="af"/>
-                  <w:rFonts w:ascii="宋体" w:eastAsia="宋体" w:hAnsi="宋体" w:cs="宋体" w:hint="eastAsia"/>
-                  <w:color w:val="FF0000"/>
-                  <w:sz w:val="24"/>
-                  <w:highlight w:val="yellow"/>
-                  <w:lang w:eastAsia="zh-CN"/>
-                </w:rPr>
-                <w:t>互评表</w:t>
-              </w:r>
-            </w:hyperlink>
+            <w:r>
+              <w:fldChar w:fldCharType="begin"/>
+            </w:r>
+            <w:r>
+              <w:rPr>
+                <w:lang w:eastAsia="zh-CN"/>
+              </w:rPr>
+              <w:instrText xml:space="preserve"> HYPERLINK \l "_组间互评表（邮件发送至shen.list@seu.edu.cn）" </w:instrText>
+            </w:r>
+            <w:r>
+              <w:fldChar w:fldCharType="separate"/>
+            </w:r>
+            <w:r>
+              <w:rPr>
+                <w:rStyle w:val="af"/>
+                <w:rFonts w:ascii="宋体" w:eastAsia="宋体" w:hAnsi="宋体" w:cs="宋体" w:hint="eastAsia"/>
+                <w:color w:val="FF0000"/>
+                <w:sz w:val="24"/>
+                <w:highlight w:val="yellow"/>
+                <w:lang w:eastAsia="zh-CN"/>
+              </w:rPr>
+              <w:t>互评表</w:t>
+            </w:r>
+            <w:r>
+              <w:rPr>
+                <w:rStyle w:val="af"/>
+                <w:rFonts w:ascii="宋体" w:eastAsia="宋体" w:hAnsi="宋体" w:cs="宋体"/>
+                <w:color w:val="FF0000"/>
+                <w:sz w:val="24"/>
+                <w:highlight w:val="yellow"/>
+                <w:lang w:eastAsia="zh-CN"/>
+              </w:rPr>
+              <w:fldChar w:fldCharType="end"/>
+            </w:r>
             <w:r>
               <w:rPr>
                 <w:rFonts w:ascii="宋体" w:eastAsia="宋体" w:hAnsi="宋体" w:cs="宋体" w:hint="eastAsia"/>
@@ -10804,6 +11459,7 @@
                 <w:lang w:eastAsia="zh-CN"/>
               </w:rPr>
             </w:pPr>
+            <w:proofErr w:type="spellStart"/>
             <w:r>
               <w:rPr>
                 <w:rFonts w:hint="eastAsia"/>
@@ -10813,6 +11469,7 @@
               </w:rPr>
               <w:t>组评</w:t>
             </w:r>
+            <w:proofErr w:type="spellEnd"/>
             <w:r>
               <w:rPr>
                 <w:rFonts w:eastAsia="宋体" w:hint="eastAsia"/>
@@ -10884,6 +11541,7 @@
                 <w:sz w:val="24"/>
               </w:rPr>
             </w:pPr>
+            <w:proofErr w:type="spellStart"/>
             <w:r>
               <w:rPr>
                 <w:rFonts w:hint="eastAsia"/>
@@ -10891,6 +11549,7 @@
               </w:rPr>
               <w:t>项目组</w:t>
             </w:r>
+            <w:proofErr w:type="spellEnd"/>
           </w:p>
         </w:tc>
         <w:tc>
@@ -10917,6 +11576,7 @@
                 <w:sz w:val="24"/>
               </w:rPr>
             </w:pPr>
+            <w:proofErr w:type="spellStart"/>
             <w:r>
               <w:rPr>
                 <w:rFonts w:hint="eastAsia"/>
@@ -10924,6 +11584,7 @@
               </w:rPr>
               <w:t>学号</w:t>
             </w:r>
+            <w:proofErr w:type="spellEnd"/>
           </w:p>
         </w:tc>
         <w:tc>
@@ -10998,7 +11659,25 @@
                 <w:sz w:val="24"/>
                 <w:lang w:eastAsia="zh-CN"/>
               </w:rPr>
-              <w:t>组间评价排序</w:t>
+              <w:t>组</w:t>
+            </w:r>
+            <w:proofErr w:type="gramStart"/>
+            <w:r>
+              <w:rPr>
+                <w:rFonts w:eastAsia="宋体" w:hint="eastAsia"/>
+                <w:sz w:val="24"/>
+                <w:lang w:eastAsia="zh-CN"/>
+              </w:rPr>
+              <w:t>间评价</w:t>
+            </w:r>
+            <w:proofErr w:type="gramEnd"/>
+            <w:r>
+              <w:rPr>
+                <w:rFonts w:eastAsia="宋体" w:hint="eastAsia"/>
+                <w:sz w:val="24"/>
+                <w:lang w:eastAsia="zh-CN"/>
+              </w:rPr>
+              <w:t>排序</w:t>
             </w:r>
           </w:p>
           <w:p>
@@ -11050,12 +11729,21 @@
                 <w:sz w:val="24"/>
               </w:rPr>
             </w:pPr>
+            <w:proofErr w:type="spellStart"/>
             <w:r>
               <w:rPr>
                 <w:rFonts w:ascii="宋体" w:eastAsia="宋体" w:hAnsi="宋体" w:cs="宋体" w:hint="eastAsia"/>
                 <w:sz w:val="24"/>
               </w:rPr>
-              <w:t>备注（</w:t>
+              <w:t>备注</w:t>
+            </w:r>
+            <w:proofErr w:type="spellEnd"/>
+            <w:r>
+              <w:rPr>
+                <w:rFonts w:ascii="宋体" w:eastAsia="宋体" w:hAnsi="宋体" w:cs="宋体" w:hint="eastAsia"/>
+                <w:sz w:val="24"/>
+              </w:rPr>
+              <w:t>（</w:t>
             </w:r>
             <w:r>
               <w:rPr>
@@ -11092,6 +11780,7 @@
                 <w:sz w:val="30"/>
               </w:rPr>
             </w:pPr>
+            <w:proofErr w:type="spellStart"/>
             <w:r>
               <w:rPr>
                 <w:rFonts w:hint="eastAsia"/>
@@ -11099,6 +11788,7 @@
               </w:rPr>
               <w:t>组长</w:t>
             </w:r>
+            <w:proofErr w:type="spellEnd"/>
           </w:p>
         </w:tc>
         <w:tc>
@@ -11604,6 +12294,7 @@
                 <w:sz w:val="18"/>
               </w:rPr>
             </w:pPr>
+            <w:proofErr w:type="spellStart"/>
             <w:r>
               <w:rPr>
                 <w:rFonts w:hint="eastAsia"/>
@@ -11613,6 +12304,7 @@
               </w:rPr>
               <w:t>组评</w:t>
             </w:r>
+            <w:proofErr w:type="spellEnd"/>
             <w:r>
               <w:rPr>
                 <w:rFonts w:ascii="宋体" w:eastAsia="宋体" w:hAnsi="宋体" w:hint="eastAsia"/>
@@ -11654,6 +12346,7 @@
                 <w:sz w:val="24"/>
               </w:rPr>
             </w:pPr>
+            <w:proofErr w:type="spellStart"/>
             <w:r>
               <w:rPr>
                 <w:rFonts w:hint="eastAsia"/>
@@ -11661,6 +12354,7 @@
               </w:rPr>
               <w:t>项目组</w:t>
             </w:r>
+            <w:proofErr w:type="spellEnd"/>
           </w:p>
         </w:tc>
         <w:tc>
@@ -11687,6 +12381,7 @@
                 <w:sz w:val="24"/>
               </w:rPr>
             </w:pPr>
+            <w:proofErr w:type="spellStart"/>
             <w:r>
               <w:rPr>
                 <w:rFonts w:hint="eastAsia"/>
@@ -11694,6 +12389,7 @@
               </w:rPr>
               <w:t>学号</w:t>
             </w:r>
+            <w:proofErr w:type="spellEnd"/>
           </w:p>
         </w:tc>
         <w:tc>
@@ -11707,6 +12403,7 @@
                 <w:sz w:val="24"/>
               </w:rPr>
             </w:pPr>
+            <w:proofErr w:type="spellStart"/>
             <w:r>
               <w:rPr>
                 <w:rFonts w:hint="eastAsia"/>
@@ -11714,6 +12411,7 @@
               </w:rPr>
               <w:t>自我评价</w:t>
             </w:r>
+            <w:proofErr w:type="spellEnd"/>
           </w:p>
           <w:p>
             <w:pPr>
@@ -11759,6 +12457,7 @@
                 <w:lang w:eastAsia="zh-CN"/>
               </w:rPr>
             </w:pPr>
+            <w:proofErr w:type="spellStart"/>
             <w:r>
               <w:rPr>
                 <w:rFonts w:hint="eastAsia"/>
@@ -11766,6 +12465,7 @@
               </w:rPr>
               <w:t>组内评价排序</w:t>
             </w:r>
+            <w:proofErr w:type="spellEnd"/>
           </w:p>
           <w:p>
             <w:pPr>
@@ -11816,12 +12516,21 @@
                 <w:sz w:val="24"/>
               </w:rPr>
             </w:pPr>
+            <w:proofErr w:type="spellStart"/>
             <w:r>
               <w:rPr>
                 <w:rFonts w:hint="eastAsia"/>
                 <w:sz w:val="24"/>
               </w:rPr>
-              <w:t>备注（分工）</w:t>
+              <w:t>备注（分工</w:t>
+            </w:r>
+            <w:proofErr w:type="spellEnd"/>
+            <w:r>
+              <w:rPr>
+                <w:rFonts w:hint="eastAsia"/>
+                <w:sz w:val="24"/>
+              </w:rPr>
+              <w:t>）</w:t>
             </w:r>
           </w:p>
         </w:tc>
@@ -11842,6 +12551,7 @@
                 <w:sz w:val="30"/>
               </w:rPr>
             </w:pPr>
+            <w:proofErr w:type="spellStart"/>
             <w:r>
               <w:rPr>
                 <w:rFonts w:hint="eastAsia"/>
@@ -11849,6 +12559,7 @@
               </w:rPr>
               <w:t>组长</w:t>
             </w:r>
+            <w:proofErr w:type="spellEnd"/>
           </w:p>
         </w:tc>
         <w:tc>
@@ -11958,6 +12669,7 @@
                 <w:sz w:val="30"/>
               </w:rPr>
             </w:pPr>
+            <w:proofErr w:type="spellStart"/>
             <w:r>
               <w:rPr>
                 <w:rFonts w:hint="eastAsia"/>
@@ -11965,6 +12677,7 @@
               </w:rPr>
               <w:t>组员</w:t>
             </w:r>
+            <w:proofErr w:type="spellEnd"/>
           </w:p>
         </w:tc>
         <w:tc>
@@ -12803,6 +13516,7 @@
         </w:rPr>
         <w:t>【以下为报告参考纲要；</w:t>
       </w:r>
+      <w:proofErr w:type="spellStart"/>
       <w:r>
         <w:rPr>
           <w:rFonts w:ascii="宋体" w:hAnsi="宋体" w:hint="eastAsia"/>
@@ -12811,7 +13525,18 @@
           <w:u w:val="single"/>
           <w:lang w:eastAsia="zh-CN"/>
         </w:rPr>
-        <w:t>不是系统介绍，也不是源代码说明！</w:t>
+        <w:t>不是系统介绍，也不是源代码说明</w:t>
+      </w:r>
+      <w:proofErr w:type="spellEnd"/>
+      <w:r>
+        <w:rPr>
+          <w:rFonts w:ascii="宋体" w:hAnsi="宋体" w:hint="eastAsia"/>
+          <w:color w:val="FF0000"/>
+          <w:sz w:val="24"/>
+          <w:u w:val="single"/>
+          <w:lang w:eastAsia="zh-CN"/>
+        </w:rPr>
+        <w:t>！</w:t>
       </w:r>
       <w:r>
         <w:rPr>
@@ -13255,6 +13980,7 @@
                       <w:lang w:eastAsia="zh-CN"/>
                     </w:rPr>
                   </w:pPr>
+                  <w:proofErr w:type="spellStart"/>
                   <w:r>
                     <w:rPr>
                       <w:rFonts w:hint="eastAsia"/>
@@ -13263,7 +13989,18 @@
                       <w:sz w:val="24"/>
                       <w:lang w:eastAsia="zh-CN"/>
                     </w:rPr>
-                    <w:t>组内工作（具体分工）</w:t>
+                    <w:t>组内工作（具体分工</w:t>
+                  </w:r>
+                  <w:proofErr w:type="spellEnd"/>
+                  <w:r>
+                    <w:rPr>
+                      <w:rFonts w:hint="eastAsia"/>
+                      <w:b/>
+                      <w:bCs/>
+                      <w:sz w:val="24"/>
+                      <w:lang w:eastAsia="zh-CN"/>
+                    </w:rPr>
+                    <w:t>）</w:t>
                   </w:r>
                 </w:p>
                 <w:p>
@@ -13280,6 +14017,7 @@
                     </w:rPr>
                     <w:tab/>
                   </w:r>
+                  <w:proofErr w:type="spellStart"/>
                   <w:r>
                     <w:rPr>
                       <w:rFonts w:eastAsia="宋体"/>
@@ -13294,6 +14032,7 @@
                     </w:rPr>
                     <w:t>xx</w:t>
                   </w:r>
+                  <w:proofErr w:type="spellEnd"/>
                 </w:p>
                 <w:p>
                   <w:pPr>
@@ -13314,6 +14053,7 @@
                       <w:lang w:eastAsia="zh-CN"/>
                     </w:rPr>
                   </w:pPr>
+                  <w:proofErr w:type="spellStart"/>
                   <w:r>
                     <w:rPr>
                       <w:rFonts w:hint="eastAsia"/>
@@ -13325,6 +14065,7 @@
                     </w:rPr>
                     <w:t>任务完成情况总结</w:t>
                   </w:r>
+                  <w:proofErr w:type="spellEnd"/>
                 </w:p>
                 <w:p>
                   <w:pPr>
@@ -13347,6 +14088,7 @@
                     </w:rPr>
                     <w:tab/>
                   </w:r>
+                  <w:proofErr w:type="spellStart"/>
                   <w:r>
                     <w:rPr>
                       <w:rFonts w:eastAsia="宋体"/>
@@ -13367,6 +14109,7 @@
                     </w:rPr>
                     <w:t>xx</w:t>
                   </w:r>
+                  <w:proofErr w:type="spellEnd"/>
                 </w:p>
                 <w:p>
                   <w:pPr>
@@ -13401,6 +14144,7 @@
                       <w:lang w:eastAsia="zh-CN"/>
                     </w:rPr>
                   </w:pPr>
+                  <w:proofErr w:type="spellStart"/>
                   <w:r>
                     <w:rPr>
                       <w:rFonts w:hint="eastAsia"/>
@@ -13412,6 +14156,7 @@
                     </w:rPr>
                     <w:t>工作小结与体会</w:t>
                   </w:r>
+                  <w:proofErr w:type="spellEnd"/>
                 </w:p>
                 <w:p>
                   <w:pPr>
@@ -13435,6 +14180,7 @@
                     </w:rPr>
                     <w:tab/>
                   </w:r>
+                  <w:proofErr w:type="spellStart"/>
                   <w:r>
                     <w:rPr>
                       <w:rFonts w:eastAsia="宋体"/>
@@ -13457,6 +14203,7 @@
                     </w:rPr>
                     <w:t>xx</w:t>
                   </w:r>
+                  <w:proofErr w:type="spellEnd"/>
                 </w:p>
                 <w:p>
                   <w:pPr>
@@ -13809,6 +14556,7 @@
           <w:lang w:eastAsia="zh-CN"/>
         </w:rPr>
       </w:pPr>
+      <w:proofErr w:type="spellStart"/>
       <w:r>
         <w:rPr>
           <w:rFonts w:ascii="宋体" w:hAnsi="宋体" w:cs="Arial" w:hint="eastAsia"/>
@@ -13816,7 +14564,17 @@
           <w:szCs w:val="21"/>
           <w:lang w:eastAsia="zh-CN"/>
         </w:rPr>
-        <w:t>自我介绍（一句话）</w:t>
+        <w:t>自我介绍（一句话</w:t>
+      </w:r>
+      <w:proofErr w:type="spellEnd"/>
+      <w:r>
+        <w:rPr>
+          <w:rFonts w:ascii="宋体" w:hAnsi="宋体" w:cs="Arial" w:hint="eastAsia"/>
+          <w:color w:val="000000"/>
+          <w:szCs w:val="21"/>
+          <w:lang w:eastAsia="zh-CN"/>
+        </w:rPr>
+        <w:t>）</w:t>
       </w:r>
     </w:p>
     <w:p>
@@ -13836,6 +14594,7 @@
           <w:lang w:eastAsia="zh-CN"/>
         </w:rPr>
       </w:pPr>
+      <w:proofErr w:type="spellStart"/>
       <w:r>
         <w:rPr>
           <w:rFonts w:ascii="宋体" w:hAnsi="宋体" w:cs="Arial" w:hint="eastAsia"/>
@@ -13845,6 +14604,7 @@
         </w:rPr>
         <w:t>组员介绍（组员名字</w:t>
       </w:r>
+      <w:proofErr w:type="spellEnd"/>
       <w:r>
         <w:rPr>
           <w:rFonts w:ascii="宋体" w:eastAsia="宋体" w:hAnsi="宋体" w:cs="Arial" w:hint="eastAsia"/>
@@ -13917,6 +14677,7 @@
           <w:lang w:eastAsia="zh-CN"/>
         </w:rPr>
       </w:pPr>
+      <w:proofErr w:type="spellStart"/>
       <w:r>
         <w:rPr>
           <w:rFonts w:ascii="宋体" w:hAnsi="宋体" w:cs="Arial" w:hint="eastAsia"/>
@@ -13924,7 +14685,17 @@
           <w:szCs w:val="21"/>
           <w:lang w:eastAsia="zh-CN"/>
         </w:rPr>
-        <w:t>产品介绍（产品特点、如何表现设计需求等等）</w:t>
+        <w:t>产品介绍（产品特点、如何表现设计需求等等</w:t>
+      </w:r>
+      <w:proofErr w:type="spellEnd"/>
+      <w:r>
+        <w:rPr>
+          <w:rFonts w:ascii="宋体" w:hAnsi="宋体" w:cs="Arial" w:hint="eastAsia"/>
+          <w:color w:val="000000"/>
+          <w:szCs w:val="21"/>
+          <w:lang w:eastAsia="zh-CN"/>
+        </w:rPr>
+        <w:t>）</w:t>
       </w:r>
       <w:r>
         <w:rPr>
@@ -13953,6 +14724,7 @@
           <w:lang w:eastAsia="zh-CN"/>
         </w:rPr>
       </w:pPr>
+      <w:proofErr w:type="spellStart"/>
       <w:r>
         <w:rPr>
           <w:rFonts w:ascii="宋体" w:hAnsi="宋体" w:cs="Arial" w:hint="eastAsia"/>
@@ -13962,6 +14734,7 @@
         </w:rPr>
         <w:t>提问</w:t>
       </w:r>
+      <w:proofErr w:type="spellEnd"/>
     </w:p>
     <w:p>
       <w:pPr>
@@ -14114,17 +14887,36 @@
         </w:rPr>
         <w:t>答辩整个过程结束后，各组提交</w:t>
       </w:r>
-      <w:hyperlink w:anchor="_项目资料提交清单【需要教师现场验收或邮件shen.list@seu.e" w:history="1">
-        <w:r>
-          <w:rPr>
-            <w:rStyle w:val="af"/>
-            <w:rFonts w:ascii="宋体" w:eastAsia="宋体" w:hAnsi="宋体" w:cs="Arial" w:hint="eastAsia"/>
-            <w:szCs w:val="21"/>
-            <w:lang w:eastAsia="zh-CN"/>
-          </w:rPr>
-          <w:t>文档资料</w:t>
-        </w:r>
-      </w:hyperlink>
+      <w:r>
+        <w:fldChar w:fldCharType="begin"/>
+      </w:r>
+      <w:r>
+        <w:rPr>
+          <w:lang w:eastAsia="zh-CN"/>
+        </w:rPr>
+        <w:instrText xml:space="preserve"> HYPERLINK \l "_项目资料提交清单【需要教师现场验收或邮件shen.list@seu.e" </w:instrText>
+      </w:r>
+      <w:r>
+        <w:fldChar w:fldCharType="separate"/>
+      </w:r>
+      <w:r>
+        <w:rPr>
+          <w:rStyle w:val="af"/>
+          <w:rFonts w:ascii="宋体" w:eastAsia="宋体" w:hAnsi="宋体" w:cs="Arial" w:hint="eastAsia"/>
+          <w:szCs w:val="21"/>
+          <w:lang w:eastAsia="zh-CN"/>
+        </w:rPr>
+        <w:t>文档资料</w:t>
+      </w:r>
+      <w:r>
+        <w:rPr>
+          <w:rStyle w:val="af"/>
+          <w:rFonts w:ascii="宋体" w:eastAsia="宋体" w:hAnsi="宋体" w:cs="Arial"/>
+          <w:szCs w:val="21"/>
+          <w:lang w:eastAsia="zh-CN"/>
+        </w:rPr>
+        <w:fldChar w:fldCharType="end"/>
+      </w:r>
       <w:r>
         <w:rPr>
           <w:rFonts w:ascii="宋体" w:eastAsia="宋体" w:hAnsi="宋体" w:cs="Arial" w:hint="eastAsia"/>
@@ -16077,6 +16869,7 @@
               </w:rPr>
               <w:t>使用</w:t>
             </w:r>
+            <w:proofErr w:type="spellStart"/>
             <w:r>
               <w:rPr>
                 <w:rFonts w:eastAsia="宋体" w:hint="eastAsia"/>
@@ -16084,6 +16877,7 @@
               </w:rPr>
               <w:t>JavaDoc</w:t>
             </w:r>
+            <w:proofErr w:type="spellEnd"/>
             <w:r>
               <w:rPr>
                 <w:rFonts w:eastAsia="宋体" w:hint="eastAsia"/>
@@ -16710,12 +17504,14 @@
         <w:spacing w:before="0" w:after="0"/>
         <w:jc w:val="both"/>
       </w:pPr>
+      <w:proofErr w:type="spellStart"/>
       <w:r>
         <w:rPr>
           <w:rFonts w:hint="eastAsia"/>
         </w:rPr>
         <w:t>可行性研究报告</w:t>
       </w:r>
+      <w:proofErr w:type="spellEnd"/>
     </w:p>
     <w:p>
       <w:pPr>
@@ -16727,12 +17523,14 @@
         <w:spacing w:before="0" w:after="0"/>
         <w:jc w:val="both"/>
       </w:pPr>
+      <w:proofErr w:type="spellStart"/>
       <w:r>
         <w:rPr>
           <w:rFonts w:hint="eastAsia"/>
         </w:rPr>
         <w:t>项目开发计划</w:t>
       </w:r>
+      <w:proofErr w:type="spellEnd"/>
     </w:p>
     <w:p>
       <w:pPr>
@@ -16744,12 +17542,14 @@
         <w:spacing w:before="0" w:after="0"/>
         <w:jc w:val="both"/>
       </w:pPr>
+      <w:proofErr w:type="spellStart"/>
       <w:r>
         <w:rPr>
           <w:rFonts w:hint="eastAsia"/>
         </w:rPr>
         <w:t>软件需求说明书</w:t>
       </w:r>
+      <w:proofErr w:type="spellEnd"/>
     </w:p>
     <w:p>
       <w:pPr>
@@ -16761,12 +17561,14 @@
         <w:spacing w:before="0" w:after="0"/>
         <w:jc w:val="both"/>
       </w:pPr>
+      <w:proofErr w:type="spellStart"/>
       <w:r>
         <w:rPr>
           <w:rFonts w:hint="eastAsia"/>
         </w:rPr>
         <w:t>数据要求说明书</w:t>
       </w:r>
+      <w:proofErr w:type="spellEnd"/>
     </w:p>
     <w:p>
       <w:pPr>
@@ -16778,12 +17580,14 @@
         <w:spacing w:before="0" w:after="0"/>
         <w:jc w:val="both"/>
       </w:pPr>
+      <w:proofErr w:type="spellStart"/>
       <w:r>
         <w:rPr>
           <w:rFonts w:hint="eastAsia"/>
         </w:rPr>
         <w:t>概要设计说明书</w:t>
       </w:r>
+      <w:proofErr w:type="spellEnd"/>
     </w:p>
     <w:p>
       <w:pPr>
@@ -16795,12 +17599,14 @@
         <w:spacing w:before="0" w:after="0"/>
         <w:jc w:val="both"/>
       </w:pPr>
+      <w:proofErr w:type="spellStart"/>
       <w:r>
         <w:rPr>
           <w:rFonts w:hint="eastAsia"/>
         </w:rPr>
         <w:t>数据库设计说明书</w:t>
       </w:r>
+      <w:proofErr w:type="spellEnd"/>
     </w:p>
     <w:p>
       <w:pPr>
@@ -16812,12 +17618,14 @@
         <w:spacing w:before="0" w:after="0"/>
         <w:jc w:val="both"/>
       </w:pPr>
+      <w:proofErr w:type="spellStart"/>
       <w:r>
         <w:rPr>
           <w:rFonts w:hint="eastAsia"/>
         </w:rPr>
         <w:t>详细设计说明书</w:t>
       </w:r>
+      <w:proofErr w:type="spellEnd"/>
     </w:p>
     <w:p>
       <w:pPr>
@@ -16829,12 +17637,14 @@
         <w:spacing w:before="0" w:after="0"/>
         <w:jc w:val="both"/>
       </w:pPr>
+      <w:proofErr w:type="spellStart"/>
       <w:r>
         <w:rPr>
           <w:rFonts w:hint="eastAsia"/>
         </w:rPr>
         <w:t>测试计划</w:t>
       </w:r>
+      <w:proofErr w:type="spellEnd"/>
     </w:p>
     <w:p>
       <w:pPr>
@@ -16846,12 +17656,14 @@
         <w:spacing w:before="0" w:after="0"/>
         <w:jc w:val="both"/>
       </w:pPr>
+      <w:proofErr w:type="spellStart"/>
       <w:r>
         <w:rPr>
           <w:rFonts w:hint="eastAsia"/>
         </w:rPr>
         <w:t>模块开发卷宗</w:t>
       </w:r>
+      <w:proofErr w:type="spellEnd"/>
     </w:p>
     <w:p>
       <w:pPr>
@@ -16863,12 +17675,14 @@
         <w:spacing w:before="0" w:after="0"/>
         <w:jc w:val="both"/>
       </w:pPr>
+      <w:proofErr w:type="spellStart"/>
       <w:r>
         <w:rPr>
           <w:rFonts w:hint="eastAsia"/>
         </w:rPr>
         <w:t>操作手册</w:t>
       </w:r>
+      <w:proofErr w:type="spellEnd"/>
     </w:p>
     <w:p>
       <w:pPr>
@@ -16880,12 +17694,14 @@
         <w:spacing w:before="0" w:after="0"/>
         <w:jc w:val="both"/>
       </w:pPr>
+      <w:proofErr w:type="spellStart"/>
       <w:r>
         <w:rPr>
           <w:rFonts w:hint="eastAsia"/>
         </w:rPr>
         <w:t>测试分析报告</w:t>
       </w:r>
+      <w:proofErr w:type="spellEnd"/>
     </w:p>
     <w:p>
       <w:pPr>
@@ -16897,12 +17713,14 @@
         <w:spacing w:before="0" w:after="0"/>
         <w:jc w:val="both"/>
       </w:pPr>
+      <w:proofErr w:type="spellStart"/>
       <w:r>
         <w:rPr>
           <w:rFonts w:hint="eastAsia"/>
         </w:rPr>
         <w:t>用户手册</w:t>
       </w:r>
+      <w:proofErr w:type="spellEnd"/>
     </w:p>
     <w:p>
       <w:pPr>
@@ -16914,12 +17732,14 @@
         <w:spacing w:before="0" w:after="0"/>
         <w:jc w:val="both"/>
       </w:pPr>
+      <w:proofErr w:type="spellStart"/>
       <w:r>
         <w:rPr>
           <w:rFonts w:hint="eastAsia"/>
         </w:rPr>
         <w:t>项目开发总结报告</w:t>
       </w:r>
+      <w:proofErr w:type="spellEnd"/>
     </w:p>
     <w:p>
       <w:pPr>
@@ -16960,7 +17780,7 @@
           <w:lang w:eastAsia="zh-CN"/>
         </w:rPr>
       </w:pPr>
-      <w:hyperlink r:id="rId13" w:history="1">
+      <w:hyperlink r:id="rId11" w:history="1">
         <w:r>
           <w:rPr>
             <w:rStyle w:val="af"/>
@@ -16998,7 +17818,7 @@
           <w:lang w:eastAsia="zh-CN"/>
         </w:rPr>
       </w:pPr>
-      <w:hyperlink r:id="rId14" w:history="1">
+      <w:hyperlink r:id="rId12" w:history="1">
         <w:r>
           <w:rPr>
             <w:rStyle w:val="af"/>

</xml_diff>

<commit_message>
docs: update project summary and team roles documentation for vCampus
</commit_message>
<xml_diff>
--- a/软件实践安排(202509).docx
+++ b/软件实践安排(202509).docx
@@ -2144,16 +2144,34 @@
               </w:rPr>
               <w:t>见</w:t>
             </w:r>
-            <w:hyperlink w:anchor="_附件：各种文档模板" w:history="1">
-              <w:r>
-                <w:rPr>
-                  <w:rStyle w:val="af"/>
-                  <w:rFonts w:ascii="宋体" w:eastAsia="宋体" w:hAnsi="宋体" w:hint="eastAsia"/>
-                  <w:lang w:eastAsia="zh-CN"/>
-                </w:rPr>
-                <w:t>附录</w:t>
-              </w:r>
-            </w:hyperlink>
+            <w:r>
+              <w:fldChar w:fldCharType="begin"/>
+            </w:r>
+            <w:r>
+              <w:rPr>
+                <w:lang w:eastAsia="zh-CN"/>
+              </w:rPr>
+              <w:instrText xml:space="preserve"> HYPERLINK \l "_附件：各种文档模板" </w:instrText>
+            </w:r>
+            <w:r>
+              <w:fldChar w:fldCharType="separate"/>
+            </w:r>
+            <w:r>
+              <w:rPr>
+                <w:rStyle w:val="af"/>
+                <w:rFonts w:ascii="宋体" w:eastAsia="宋体" w:hAnsi="宋体" w:hint="eastAsia"/>
+                <w:lang w:eastAsia="zh-CN"/>
+              </w:rPr>
+              <w:t>附录</w:t>
+            </w:r>
+            <w:r>
+              <w:rPr>
+                <w:rStyle w:val="af"/>
+                <w:rFonts w:ascii="宋体" w:eastAsia="宋体" w:hAnsi="宋体"/>
+                <w:lang w:eastAsia="zh-CN"/>
+              </w:rPr>
+              <w:fldChar w:fldCharType="end"/>
+            </w:r>
             <w:r>
               <w:rPr>
                 <w:rStyle w:val="af"/>
@@ -2203,16 +2221,34 @@
               </w:rPr>
               <w:t>清单见</w:t>
             </w:r>
-            <w:hyperlink w:anchor="_项目资料提交清单【需要教师现场验收或邮件回复认可后方能给成绩】" w:history="1">
-              <w:r>
-                <w:rPr>
-                  <w:rStyle w:val="ae"/>
-                  <w:rFonts w:ascii="宋体" w:eastAsia="宋体" w:hAnsi="宋体" w:hint="eastAsia"/>
-                  <w:lang w:eastAsia="zh-CN"/>
-                </w:rPr>
-                <w:t>附录：项目提交资料清单</w:t>
-              </w:r>
-            </w:hyperlink>
+            <w:r>
+              <w:fldChar w:fldCharType="begin"/>
+            </w:r>
+            <w:r>
+              <w:rPr>
+                <w:lang w:eastAsia="zh-CN"/>
+              </w:rPr>
+              <w:instrText xml:space="preserve"> HYPERLINK \l "_项目资料提交清单【需要教师现场验收或邮件回复认可后方能给成绩】" </w:instrText>
+            </w:r>
+            <w:r>
+              <w:fldChar w:fldCharType="separate"/>
+            </w:r>
+            <w:r>
+              <w:rPr>
+                <w:rStyle w:val="ae"/>
+                <w:rFonts w:ascii="宋体" w:eastAsia="宋体" w:hAnsi="宋体" w:hint="eastAsia"/>
+                <w:lang w:eastAsia="zh-CN"/>
+              </w:rPr>
+              <w:t>附录：项目提交资料清单</w:t>
+            </w:r>
+            <w:r>
+              <w:rPr>
+                <w:rStyle w:val="ae"/>
+                <w:rFonts w:ascii="宋体" w:eastAsia="宋体" w:hAnsi="宋体"/>
+                <w:lang w:eastAsia="zh-CN"/>
+              </w:rPr>
+              <w:fldChar w:fldCharType="end"/>
+            </w:r>
             <w:r>
               <w:rPr>
                 <w:rFonts w:ascii="宋体" w:eastAsia="宋体" w:hAnsi="宋体" w:hint="eastAsia"/>

</xml_diff>